<commit_message>
Add monthly paid ads budget, messages-to-leads plan, and lead qualification
</commit_message>
<xml_diff>
--- a/presentations/Al_Waleed_Marketing_Strategy.docx
+++ b/presentations/Al_Waleed_Marketing_Strategy.docx
@@ -211,6 +211,24 @@
           <w:bCs w:val="0"/>
         </w:rPr>
         <w:t>سعر الشقة حسب المعلومات المتاحة ١٫٨ مليون جنيه، بمقدم ٣٠٪ يعادل ٥٤٠ ألف جنيه، والباقي على سنتين.</w:t>
+      </w:r>
+    </w:p>
+    <w:p>
+      <w:pPr>
+        <w:bidi w:val="1"/>
+        <w:jc w:val="right"/>
+      </w:pPr>
+      <w:r>
+        <w:rPr>
+          <w:rFonts w:ascii="Arial" w:hAnsi="Arial" w:cs="Arial" w:eastAsia="Arial"/>
+          <w:b w:val="0"/>
+          <w:sz w:val="24"/>
+          <w:rtl w:val="1"/>
+          <w:lang w:bidi="ar-EG"/>
+          <w:szCs w:val="24"/>
+          <w:bCs w:val="0"/>
+        </w:rPr>
+        <w:t>خطة الإعلان الممول للشهر الأول: ٣٠ يوم بميزانية ٣٠٬٠٠٠ جنيه، بمعدل مستهدف ١٬٠٠٠ جنيه يوميًا. أول ٧ أيام رسائل بإجمالي ٧٬٠٠٠ جنيه، وبعدها ٢٣ يوم ليدز بإجمالي ٢٣٬٠٠٠ جنيه لتأهيل العملاء وفلترتهم.</w:t>
       </w:r>
     </w:p>
     <w:p>
@@ -455,6 +473,7 @@
           </w:tcPr>
           <w:p>
             <w:pPr>
+              <w:keepNext/>
               <w:bidi w:val="1"/>
               <w:spacing w:before="100" w:after="100"/>
               <w:jc w:val="right"/>
@@ -482,6 +501,7 @@
           </w:tcPr>
           <w:p>
             <w:pPr>
+              <w:keepNext/>
               <w:bidi w:val="1"/>
               <w:spacing w:before="100" w:after="100"/>
               <w:jc w:val="right"/>
@@ -509,6 +529,7 @@
           </w:tcPr>
           <w:p>
             <w:pPr>
+              <w:keepNext/>
               <w:bidi w:val="1"/>
               <w:spacing w:before="100" w:after="100"/>
               <w:jc w:val="right"/>
@@ -536,6 +557,7 @@
           </w:tcPr>
           <w:p>
             <w:pPr>
+              <w:keepNext/>
               <w:bidi w:val="1"/>
               <w:spacing w:before="100" w:after="100"/>
               <w:jc w:val="right"/>
@@ -567,6 +589,7 @@
           </w:tcPr>
           <w:p>
             <w:pPr>
+              <w:keepNext/>
               <w:bidi w:val="1"/>
               <w:spacing w:before="100" w:after="100"/>
               <w:jc w:val="right"/>
@@ -593,6 +616,7 @@
           </w:tcPr>
           <w:p>
             <w:pPr>
+              <w:keepNext/>
               <w:bidi w:val="1"/>
               <w:spacing w:before="100" w:after="100"/>
               <w:jc w:val="right"/>
@@ -619,6 +643,7 @@
           </w:tcPr>
           <w:p>
             <w:pPr>
+              <w:keepNext/>
               <w:bidi w:val="1"/>
               <w:spacing w:before="100" w:after="100"/>
               <w:jc w:val="right"/>
@@ -645,6 +670,7 @@
           </w:tcPr>
           <w:p>
             <w:pPr>
+              <w:keepNext/>
               <w:bidi w:val="1"/>
               <w:spacing w:before="100" w:after="100"/>
               <w:jc w:val="right"/>
@@ -676,6 +702,7 @@
           </w:tcPr>
           <w:p>
             <w:pPr>
+              <w:keepNext/>
               <w:bidi w:val="1"/>
               <w:spacing w:before="100" w:after="100"/>
               <w:jc w:val="right"/>
@@ -702,6 +729,7 @@
           </w:tcPr>
           <w:p>
             <w:pPr>
+              <w:keepNext/>
               <w:bidi w:val="1"/>
               <w:spacing w:before="100" w:after="100"/>
               <w:jc w:val="right"/>
@@ -728,6 +756,7 @@
           </w:tcPr>
           <w:p>
             <w:pPr>
+              <w:keepNext/>
               <w:bidi w:val="1"/>
               <w:spacing w:before="100" w:after="100"/>
               <w:jc w:val="right"/>
@@ -754,6 +783,7 @@
           </w:tcPr>
           <w:p>
             <w:pPr>
+              <w:keepNext/>
               <w:bidi w:val="1"/>
               <w:spacing w:before="100" w:after="100"/>
               <w:jc w:val="right"/>
@@ -785,6 +815,7 @@
           </w:tcPr>
           <w:p>
             <w:pPr>
+              <w:keepNext/>
               <w:bidi w:val="1"/>
               <w:spacing w:before="100" w:after="100"/>
               <w:jc w:val="right"/>
@@ -811,6 +842,7 @@
           </w:tcPr>
           <w:p>
             <w:pPr>
+              <w:keepNext/>
               <w:bidi w:val="1"/>
               <w:spacing w:before="100" w:after="100"/>
               <w:jc w:val="right"/>
@@ -837,6 +869,7 @@
           </w:tcPr>
           <w:p>
             <w:pPr>
+              <w:keepNext/>
               <w:bidi w:val="1"/>
               <w:spacing w:before="100" w:after="100"/>
               <w:jc w:val="right"/>
@@ -863,6 +896,7 @@
           </w:tcPr>
           <w:p>
             <w:pPr>
+              <w:keepNext/>
               <w:bidi w:val="1"/>
               <w:spacing w:before="100" w:after="100"/>
               <w:jc w:val="right"/>
@@ -894,6 +928,7 @@
           </w:tcPr>
           <w:p>
             <w:pPr>
+              <w:keepNext/>
               <w:bidi w:val="1"/>
               <w:spacing w:before="100" w:after="100"/>
               <w:jc w:val="right"/>
@@ -920,6 +955,7 @@
           </w:tcPr>
           <w:p>
             <w:pPr>
+              <w:keepNext/>
               <w:bidi w:val="1"/>
               <w:spacing w:before="100" w:after="100"/>
               <w:jc w:val="right"/>
@@ -946,6 +982,7 @@
           </w:tcPr>
           <w:p>
             <w:pPr>
+              <w:keepNext/>
               <w:bidi w:val="1"/>
               <w:spacing w:before="100" w:after="100"/>
               <w:jc w:val="right"/>
@@ -972,6 +1009,7 @@
           </w:tcPr>
           <w:p>
             <w:pPr>
+              <w:keepNext/>
               <w:bidi w:val="1"/>
               <w:spacing w:before="100" w:after="100"/>
               <w:jc w:val="right"/>
@@ -1210,6 +1248,7 @@
           </w:tcPr>
           <w:p>
             <w:pPr>
+              <w:keepNext/>
               <w:bidi w:val="1"/>
               <w:spacing w:before="100" w:after="100"/>
               <w:jc w:val="right"/>
@@ -1237,6 +1276,7 @@
           </w:tcPr>
           <w:p>
             <w:pPr>
+              <w:keepNext/>
               <w:bidi w:val="1"/>
               <w:spacing w:before="100" w:after="100"/>
               <w:jc w:val="right"/>
@@ -1268,6 +1308,7 @@
           </w:tcPr>
           <w:p>
             <w:pPr>
+              <w:keepNext/>
               <w:bidi w:val="1"/>
               <w:spacing w:before="100" w:after="100"/>
               <w:jc w:val="right"/>
@@ -1294,6 +1335,7 @@
           </w:tcPr>
           <w:p>
             <w:pPr>
+              <w:keepNext/>
               <w:bidi w:val="1"/>
               <w:spacing w:before="100" w:after="100"/>
               <w:jc w:val="right"/>
@@ -1325,6 +1367,7 @@
           </w:tcPr>
           <w:p>
             <w:pPr>
+              <w:keepNext/>
               <w:bidi w:val="1"/>
               <w:spacing w:before="100" w:after="100"/>
               <w:jc w:val="right"/>
@@ -1351,6 +1394,7 @@
           </w:tcPr>
           <w:p>
             <w:pPr>
+              <w:keepNext/>
               <w:bidi w:val="1"/>
               <w:spacing w:before="100" w:after="100"/>
               <w:jc w:val="right"/>
@@ -1382,6 +1426,7 @@
           </w:tcPr>
           <w:p>
             <w:pPr>
+              <w:keepNext/>
               <w:bidi w:val="1"/>
               <w:spacing w:before="100" w:after="100"/>
               <w:jc w:val="right"/>
@@ -1408,6 +1453,7 @@
           </w:tcPr>
           <w:p>
             <w:pPr>
+              <w:keepNext/>
               <w:bidi w:val="1"/>
               <w:spacing w:before="100" w:after="100"/>
               <w:jc w:val="right"/>
@@ -1439,6 +1485,7 @@
           </w:tcPr>
           <w:p>
             <w:pPr>
+              <w:keepNext/>
               <w:bidi w:val="1"/>
               <w:spacing w:before="100" w:after="100"/>
               <w:jc w:val="right"/>
@@ -1465,6 +1512,7 @@
           </w:tcPr>
           <w:p>
             <w:pPr>
+              <w:keepNext/>
               <w:bidi w:val="1"/>
               <w:spacing w:before="100" w:after="100"/>
               <w:jc w:val="right"/>
@@ -1706,6 +1754,7 @@
           </w:tcPr>
           <w:p>
             <w:pPr>
+              <w:keepNext/>
               <w:bidi w:val="1"/>
               <w:spacing w:before="100" w:after="100"/>
               <w:jc w:val="right"/>
@@ -1733,6 +1782,7 @@
           </w:tcPr>
           <w:p>
             <w:pPr>
+              <w:keepNext/>
               <w:bidi w:val="1"/>
               <w:spacing w:before="100" w:after="100"/>
               <w:jc w:val="right"/>
@@ -1760,6 +1810,7 @@
           </w:tcPr>
           <w:p>
             <w:pPr>
+              <w:keepNext/>
               <w:bidi w:val="1"/>
               <w:spacing w:before="100" w:after="100"/>
               <w:jc w:val="right"/>
@@ -1791,6 +1842,7 @@
           </w:tcPr>
           <w:p>
             <w:pPr>
+              <w:keepNext/>
               <w:bidi w:val="1"/>
               <w:spacing w:before="100" w:after="100"/>
               <w:jc w:val="right"/>
@@ -1817,6 +1869,7 @@
           </w:tcPr>
           <w:p>
             <w:pPr>
+              <w:keepNext/>
               <w:bidi w:val="1"/>
               <w:spacing w:before="100" w:after="100"/>
               <w:jc w:val="right"/>
@@ -1843,6 +1896,7 @@
           </w:tcPr>
           <w:p>
             <w:pPr>
+              <w:keepNext/>
               <w:bidi w:val="1"/>
               <w:spacing w:before="100" w:after="100"/>
               <w:jc w:val="right"/>
@@ -1874,6 +1928,7 @@
           </w:tcPr>
           <w:p>
             <w:pPr>
+              <w:keepNext/>
               <w:bidi w:val="1"/>
               <w:spacing w:before="100" w:after="100"/>
               <w:jc w:val="right"/>
@@ -1900,6 +1955,7 @@
           </w:tcPr>
           <w:p>
             <w:pPr>
+              <w:keepNext/>
               <w:bidi w:val="1"/>
               <w:spacing w:before="100" w:after="100"/>
               <w:jc w:val="right"/>
@@ -1926,6 +1982,7 @@
           </w:tcPr>
           <w:p>
             <w:pPr>
+              <w:keepNext/>
               <w:bidi w:val="1"/>
               <w:spacing w:before="100" w:after="100"/>
               <w:jc w:val="right"/>
@@ -1957,6 +2014,7 @@
           </w:tcPr>
           <w:p>
             <w:pPr>
+              <w:keepNext/>
               <w:bidi w:val="1"/>
               <w:spacing w:before="100" w:after="100"/>
               <w:jc w:val="right"/>
@@ -1983,6 +2041,7 @@
           </w:tcPr>
           <w:p>
             <w:pPr>
+              <w:keepNext/>
               <w:bidi w:val="1"/>
               <w:spacing w:before="100" w:after="100"/>
               <w:jc w:val="right"/>
@@ -2009,6 +2068,7 @@
           </w:tcPr>
           <w:p>
             <w:pPr>
+              <w:keepNext/>
               <w:bidi w:val="1"/>
               <w:spacing w:before="100" w:after="100"/>
               <w:jc w:val="right"/>
@@ -2040,6 +2100,7 @@
           </w:tcPr>
           <w:p>
             <w:pPr>
+              <w:keepNext/>
               <w:bidi w:val="1"/>
               <w:spacing w:before="100" w:after="100"/>
               <w:jc w:val="right"/>
@@ -2066,6 +2127,7 @@
           </w:tcPr>
           <w:p>
             <w:pPr>
+              <w:keepNext/>
               <w:bidi w:val="1"/>
               <w:spacing w:before="100" w:after="100"/>
               <w:jc w:val="right"/>
@@ -2092,6 +2154,7 @@
           </w:tcPr>
           <w:p>
             <w:pPr>
+              <w:keepNext/>
               <w:bidi w:val="1"/>
               <w:spacing w:before="100" w:after="100"/>
               <w:jc w:val="right"/>
@@ -2471,7 +2534,7 @@
           <w:szCs w:val="24"/>
           <w:bCs w:val="0"/>
         </w:rPr>
-        <w:t>هنشتغل بدورة أولى مدتها ٩٠ يوم. الأرقام البيعية النهائية تتحدد بعد معرفة عدد الوحدات والميزانية والطاقة الاستيعابية لفريق المبيعات.</w:t>
+        <w:t>الاستراتيجية العامة مدتها ٩٠ يوم، لكن ميزانية الإعلان المحددة تخص أول ٣٠ يوم فقط: ٣٠٬٠٠٠ جنيه. أي صرف بعد الشهر الأول يتحدد بشكل منفصل. أهداف الحجوزات تتحدد بعد معرفة المخزون والطاقة الاستيعابية ونتائج الاختبار.</w:t>
       </w:r>
     </w:p>
     <w:p>
@@ -2492,7 +2555,7 @@
           <w:szCs w:val="28"/>
           <w:bCs w:val="1"/>
         </w:rPr>
-        <w:t>أول أسبوعين: تجهيز وقياس</w:t>
+        <w:t>الأسبوع الأول: رسائل وقياس أولي</w:t>
       </w:r>
     </w:p>
     <w:p>
@@ -2613,7 +2676,25 @@
           <w:szCs w:val="28"/>
           <w:bCs w:val="1"/>
         </w:rPr>
-        <w:t>من الأسبوع الثالث لنهاية الشهر الثاني: تحسين التحويل</w:t>
+        <w:t>من اليوم ٨ لليوم ٣٠: ليدز وتأهيل وتحسين التحويل</w:t>
+      </w:r>
+    </w:p>
+    <w:p>
+      <w:pPr>
+        <w:bidi w:val="1"/>
+        <w:jc w:val="right"/>
+      </w:pPr>
+      <w:r>
+        <w:rPr>
+          <w:rFonts w:ascii="Arial" w:hAnsi="Arial" w:cs="Arial" w:eastAsia="Arial"/>
+          <w:b w:val="0"/>
+          <w:sz w:val="24"/>
+          <w:rtl w:val="1"/>
+          <w:lang w:bidi="ar-EG"/>
+          <w:szCs w:val="24"/>
+          <w:bCs w:val="0"/>
+        </w:rPr>
+        <w:t>بنوقف حملات الرسائل المدفوعة عند نهاية اليوم ٧، ونحوّل الإنفاق لليدز من اليوم ٨. محادثات الأسبوع الأول تفضل تحت متابعة المبيعات من غير ميزانية رسائل إضافية.</w:t>
       </w:r>
     </w:p>
     <w:p>
@@ -2714,7 +2795,25 @@
           <w:szCs w:val="28"/>
           <w:bCs w:val="1"/>
         </w:rPr>
-        <w:t>الشهر الثالث: دعم الحجوزات</w:t>
+        <w:t>بعد الشهر الأول وحتى اليوم ٩٠: متابعة ودعم الحجوزات</w:t>
+      </w:r>
+    </w:p>
+    <w:p>
+      <w:pPr>
+        <w:bidi w:val="1"/>
+        <w:jc w:val="right"/>
+      </w:pPr>
+      <w:r>
+        <w:rPr>
+          <w:rFonts w:ascii="Arial" w:hAnsi="Arial" w:cs="Arial" w:eastAsia="Arial"/>
+          <w:b w:val="0"/>
+          <w:sz w:val="24"/>
+          <w:rtl w:val="1"/>
+          <w:lang w:bidi="ar-EG"/>
+          <w:szCs w:val="24"/>
+          <w:bCs w:val="0"/>
+        </w:rPr>
+        <w:t>المتابعة والمحتوى العضوي يستمروا. استمرار أو زيادة الإعلان المدفوع بعد اليوم ٣٠ محتاج خطة وميزانية جديدة، ومش داخل إجمالي الـ٣٠٬٠٠٠ جنيه.</w:t>
       </w:r>
     </w:p>
     <w:p>
@@ -2843,6 +2942,7 @@
           </w:tcPr>
           <w:p>
             <w:pPr>
+              <w:keepNext/>
               <w:bidi w:val="1"/>
               <w:spacing w:before="100" w:after="100"/>
               <w:jc w:val="right"/>
@@ -2870,6 +2970,7 @@
           </w:tcPr>
           <w:p>
             <w:pPr>
+              <w:keepNext/>
               <w:bidi w:val="1"/>
               <w:spacing w:before="100" w:after="100"/>
               <w:jc w:val="right"/>
@@ -2901,6 +3002,7 @@
           </w:tcPr>
           <w:p>
             <w:pPr>
+              <w:keepNext/>
               <w:bidi w:val="1"/>
               <w:spacing w:before="100" w:after="100"/>
               <w:jc w:val="right"/>
@@ -2927,6 +3029,7 @@
           </w:tcPr>
           <w:p>
             <w:pPr>
+              <w:keepNext/>
               <w:bidi w:val="1"/>
               <w:spacing w:before="100" w:after="100"/>
               <w:jc w:val="right"/>
@@ -2958,6 +3061,7 @@
           </w:tcPr>
           <w:p>
             <w:pPr>
+              <w:keepNext/>
               <w:bidi w:val="1"/>
               <w:spacing w:before="100" w:after="100"/>
               <w:jc w:val="right"/>
@@ -2984,6 +3088,7 @@
           </w:tcPr>
           <w:p>
             <w:pPr>
+              <w:keepNext/>
               <w:bidi w:val="1"/>
               <w:spacing w:before="100" w:after="100"/>
               <w:jc w:val="right"/>
@@ -3015,6 +3120,7 @@
           </w:tcPr>
           <w:p>
             <w:pPr>
+              <w:keepNext/>
               <w:bidi w:val="1"/>
               <w:spacing w:before="100" w:after="100"/>
               <w:jc w:val="right"/>
@@ -3041,6 +3147,7 @@
           </w:tcPr>
           <w:p>
             <w:pPr>
+              <w:keepNext/>
               <w:bidi w:val="1"/>
               <w:spacing w:before="100" w:after="100"/>
               <w:jc w:val="right"/>
@@ -3072,6 +3179,7 @@
           </w:tcPr>
           <w:p>
             <w:pPr>
+              <w:keepNext/>
               <w:bidi w:val="1"/>
               <w:spacing w:before="100" w:after="100"/>
               <w:jc w:val="right"/>
@@ -3098,6 +3206,7 @@
           </w:tcPr>
           <w:p>
             <w:pPr>
+              <w:keepNext/>
               <w:bidi w:val="1"/>
               <w:spacing w:before="100" w:after="100"/>
               <w:jc w:val="right"/>
@@ -3129,6 +3238,7 @@
           </w:tcPr>
           <w:p>
             <w:pPr>
+              <w:keepNext/>
               <w:bidi w:val="1"/>
               <w:spacing w:before="100" w:after="100"/>
               <w:jc w:val="right"/>
@@ -3155,6 +3265,7 @@
           </w:tcPr>
           <w:p>
             <w:pPr>
+              <w:keepNext/>
               <w:bidi w:val="1"/>
               <w:spacing w:before="100" w:after="100"/>
               <w:jc w:val="right"/>
@@ -3392,7 +3503,7 @@
           <w:szCs w:val="24"/>
           <w:bCs w:val="0"/>
         </w:rPr>
-        <w:t>ماهنحطش وعد بعدد حجوزات من غير ميزانية ومخزون وبيانات أولية.</w:t>
+        <w:t>الميزانية بقت محددة للشهر الأول؛ عدد الليدز والحجوزات ماينفعش نوعد بيه قبل بيانات فعلية عن تكلفة العميل المؤهل والمخزون والتحويل.</w:t>
       </w:r>
     </w:p>
     <w:p>
@@ -3784,6 +3895,1944 @@
       </w:r>
     </w:p>
     <w:p>
+      <w:r>
+        <w:br w:type="page"/>
+      </w:r>
+    </w:p>
+    <w:p>
+      <w:pPr>
+        <w:pStyle w:val="Heading1"/>
+        <w:keepNext/>
+        <w:bidi w:val="1"/>
+        <w:jc w:val="right"/>
+      </w:pPr>
+      <w:r>
+        <w:rPr>
+          <w:rFonts w:ascii="Arial" w:hAnsi="Arial" w:cs="Arial" w:eastAsia="Arial"/>
+          <w:b/>
+          <w:color w:val="163B4A"/>
+          <w:sz w:val="38"/>
+          <w:rtl w:val="1"/>
+          <w:lang w:bidi="ar-EG"/>
+          <w:szCs w:val="38"/>
+          <w:bCs w:val="1"/>
+        </w:rPr>
+        <w:t>٦. خطة صرف الإعلانات الممولة وتأهيل العملاء</w:t>
+      </w:r>
+    </w:p>
+    <w:p>
+      <w:pPr>
+        <w:bidi w:val="1"/>
+        <w:jc w:val="right"/>
+      </w:pPr>
+      <w:r>
+        <w:rPr>
+          <w:rFonts w:ascii="Arial" w:hAnsi="Arial" w:cs="Arial" w:eastAsia="Arial"/>
+          <w:b w:val="0"/>
+          <w:sz w:val="24"/>
+          <w:rtl w:val="1"/>
+          <w:lang w:bidi="ar-EG"/>
+          <w:szCs w:val="24"/>
+          <w:bCs w:val="0"/>
+        </w:rPr>
+        <w:t>الهدف: نجمع استفسارات ونتعلم من أسئلة العملاء في أول أسبوع، وبعدها نشتغل ليدز بفورم تأهيل يساعدنا نوصل لعملاء أنسب ونرتب أولوية المتابعة.</w:t>
+      </w:r>
+    </w:p>
+    <w:p>
+      <w:pPr>
+        <w:pStyle w:val="Heading2"/>
+        <w:keepNext/>
+        <w:bidi w:val="1"/>
+        <w:jc w:val="right"/>
+      </w:pPr>
+      <w:r>
+        <w:rPr>
+          <w:rFonts w:ascii="Arial" w:hAnsi="Arial" w:cs="Arial" w:eastAsia="Arial"/>
+          <w:b/>
+          <w:color w:val="216575"/>
+          <w:sz w:val="28"/>
+          <w:rtl w:val="1"/>
+          <w:lang w:bidi="ar-EG"/>
+          <w:szCs w:val="28"/>
+          <w:bCs w:val="1"/>
+        </w:rPr>
+        <w:t>الميزانية والمدة</w:t>
+      </w:r>
+    </w:p>
+    <w:tbl>
+      <w:tblPr>
+        <w:tblStyle w:val="TableGrid"/>
+        <w:tblW w:type="auto" w:w="0"/>
+        <w:jc w:val="center"/>
+        <w:tblLook w:firstColumn="1" w:firstRow="1" w:lastColumn="0" w:lastRow="0" w:noHBand="0" w:noVBand="1" w:val="04A0"/>
+        <w:bidiVisual w:val="1"/>
+      </w:tblPr>
+      <w:tblGrid>
+        <w:gridCol w:w="1973"/>
+        <w:gridCol w:w="1973"/>
+        <w:gridCol w:w="1973"/>
+        <w:gridCol w:w="1973"/>
+        <w:gridCol w:w="1973"/>
+      </w:tblGrid>
+      <w:tr>
+        <w:trPr>
+          <w:tblHeader/>
+          <w:cantSplit/>
+        </w:trPr>
+        <w:tc>
+          <w:tcPr>
+            <w:tcW w:type="dxa" w:w="1973"/>
+            <w:vAlign w:val="center"/>
+            <w:shd w:fill="163B4A"/>
+          </w:tcPr>
+          <w:p>
+            <w:pPr>
+              <w:keepNext/>
+              <w:bidi w:val="1"/>
+              <w:spacing w:before="100" w:after="100"/>
+              <w:jc w:val="right"/>
+            </w:pPr>
+            <w:r>
+              <w:rPr>
+                <w:rFonts w:ascii="Arial" w:hAnsi="Arial" w:cs="Arial" w:eastAsia="Arial"/>
+                <w:b/>
+                <w:color w:val="FFFFFF"/>
+                <w:sz w:val="21"/>
+                <w:rtl w:val="1"/>
+                <w:lang w:bidi="ar-EG"/>
+                <w:szCs w:val="21"/>
+                <w:bCs w:val="1"/>
+              </w:rPr>
+              <w:t>المرحلة</w:t>
+            </w:r>
+          </w:p>
+        </w:tc>
+        <w:tc>
+          <w:tcPr>
+            <w:tcW w:type="dxa" w:w="1973"/>
+            <w:vAlign w:val="center"/>
+            <w:shd w:fill="163B4A"/>
+          </w:tcPr>
+          <w:p>
+            <w:pPr>
+              <w:keepNext/>
+              <w:bidi w:val="1"/>
+              <w:spacing w:before="100" w:after="100"/>
+              <w:jc w:val="right"/>
+            </w:pPr>
+            <w:r>
+              <w:rPr>
+                <w:rFonts w:ascii="Arial" w:hAnsi="Arial" w:cs="Arial" w:eastAsia="Arial"/>
+                <w:b/>
+                <w:color w:val="FFFFFF"/>
+                <w:sz w:val="21"/>
+                <w:rtl w:val="1"/>
+                <w:lang w:bidi="ar-EG"/>
+                <w:szCs w:val="21"/>
+                <w:bCs w:val="1"/>
+              </w:rPr>
+              <w:t>الفترة</w:t>
+            </w:r>
+          </w:p>
+        </w:tc>
+        <w:tc>
+          <w:tcPr>
+            <w:tcW w:type="dxa" w:w="1973"/>
+            <w:vAlign w:val="center"/>
+            <w:shd w:fill="163B4A"/>
+          </w:tcPr>
+          <w:p>
+            <w:pPr>
+              <w:keepNext/>
+              <w:bidi w:val="1"/>
+              <w:spacing w:before="100" w:after="100"/>
+              <w:jc w:val="right"/>
+            </w:pPr>
+            <w:r>
+              <w:rPr>
+                <w:rFonts w:ascii="Arial" w:hAnsi="Arial" w:cs="Arial" w:eastAsia="Arial"/>
+                <w:b/>
+                <w:color w:val="FFFFFF"/>
+                <w:sz w:val="21"/>
+                <w:rtl w:val="1"/>
+                <w:lang w:bidi="ar-EG"/>
+                <w:szCs w:val="21"/>
+                <w:bCs w:val="1"/>
+              </w:rPr>
+              <w:t>عدد الأيام</w:t>
+            </w:r>
+          </w:p>
+        </w:tc>
+        <w:tc>
+          <w:tcPr>
+            <w:tcW w:type="dxa" w:w="1973"/>
+            <w:vAlign w:val="center"/>
+            <w:shd w:fill="163B4A"/>
+          </w:tcPr>
+          <w:p>
+            <w:pPr>
+              <w:keepNext/>
+              <w:bidi w:val="1"/>
+              <w:spacing w:before="100" w:after="100"/>
+              <w:jc w:val="right"/>
+            </w:pPr>
+            <w:r>
+              <w:rPr>
+                <w:rFonts w:ascii="Arial" w:hAnsi="Arial" w:cs="Arial" w:eastAsia="Arial"/>
+                <w:b/>
+                <w:color w:val="FFFFFF"/>
+                <w:sz w:val="21"/>
+                <w:rtl w:val="1"/>
+                <w:lang w:bidi="ar-EG"/>
+                <w:szCs w:val="21"/>
+                <w:bCs w:val="1"/>
+              </w:rPr>
+              <w:t>المستهدف يوميًا</w:t>
+            </w:r>
+          </w:p>
+        </w:tc>
+        <w:tc>
+          <w:tcPr>
+            <w:tcW w:type="dxa" w:w="1973"/>
+            <w:vAlign w:val="center"/>
+            <w:shd w:fill="163B4A"/>
+          </w:tcPr>
+          <w:p>
+            <w:pPr>
+              <w:keepNext/>
+              <w:bidi w:val="1"/>
+              <w:spacing w:before="100" w:after="100"/>
+              <w:jc w:val="right"/>
+            </w:pPr>
+            <w:r>
+              <w:rPr>
+                <w:rFonts w:ascii="Arial" w:hAnsi="Arial" w:cs="Arial" w:eastAsia="Arial"/>
+                <w:b/>
+                <w:color w:val="FFFFFF"/>
+                <w:sz w:val="21"/>
+                <w:rtl w:val="1"/>
+                <w:lang w:bidi="ar-EG"/>
+                <w:szCs w:val="21"/>
+                <w:bCs w:val="1"/>
+              </w:rPr>
+              <w:t>إجمالي المرحلة</w:t>
+            </w:r>
+          </w:p>
+        </w:tc>
+      </w:tr>
+      <w:tr>
+        <w:trPr>
+          <w:cantSplit/>
+        </w:trPr>
+        <w:tc>
+          <w:tcPr>
+            <w:tcW w:type="dxa" w:w="1973"/>
+            <w:vAlign w:val="center"/>
+          </w:tcPr>
+          <w:p>
+            <w:pPr>
+              <w:keepNext/>
+              <w:bidi w:val="1"/>
+              <w:spacing w:before="100" w:after="100"/>
+              <w:jc w:val="right"/>
+            </w:pPr>
+            <w:r>
+              <w:rPr>
+                <w:rFonts w:ascii="Arial" w:hAnsi="Arial" w:cs="Arial" w:eastAsia="Arial"/>
+                <w:b w:val="0"/>
+                <w:color w:val="26343B"/>
+                <w:sz w:val="21"/>
+                <w:rtl w:val="1"/>
+                <w:lang w:bidi="ar-EG"/>
+                <w:szCs w:val="21"/>
+                <w:bCs w:val="0"/>
+              </w:rPr>
+              <w:t>إعلانات رسائل</w:t>
+            </w:r>
+          </w:p>
+        </w:tc>
+        <w:tc>
+          <w:tcPr>
+            <w:tcW w:type="dxa" w:w="1973"/>
+            <w:vAlign w:val="center"/>
+          </w:tcPr>
+          <w:p>
+            <w:pPr>
+              <w:keepNext/>
+              <w:bidi w:val="1"/>
+              <w:spacing w:before="100" w:after="100"/>
+              <w:jc w:val="right"/>
+            </w:pPr>
+            <w:r>
+              <w:rPr>
+                <w:rFonts w:ascii="Arial" w:hAnsi="Arial" w:cs="Arial" w:eastAsia="Arial"/>
+                <w:b w:val="0"/>
+                <w:color w:val="26343B"/>
+                <w:sz w:val="21"/>
+                <w:rtl w:val="1"/>
+                <w:lang w:bidi="ar-EG"/>
+                <w:szCs w:val="21"/>
+                <w:bCs w:val="0"/>
+              </w:rPr>
+              <w:t>اليوم ١–٧</w:t>
+            </w:r>
+          </w:p>
+        </w:tc>
+        <w:tc>
+          <w:tcPr>
+            <w:tcW w:type="dxa" w:w="1973"/>
+            <w:vAlign w:val="center"/>
+          </w:tcPr>
+          <w:p>
+            <w:pPr>
+              <w:keepNext/>
+              <w:bidi w:val="1"/>
+              <w:spacing w:before="100" w:after="100"/>
+              <w:jc w:val="right"/>
+            </w:pPr>
+            <w:r>
+              <w:rPr>
+                <w:rFonts w:ascii="Arial" w:hAnsi="Arial" w:cs="Arial" w:eastAsia="Arial"/>
+                <w:b w:val="0"/>
+                <w:color w:val="26343B"/>
+                <w:sz w:val="21"/>
+                <w:rtl w:val="1"/>
+                <w:lang w:bidi="ar-EG"/>
+                <w:szCs w:val="21"/>
+                <w:bCs w:val="0"/>
+              </w:rPr>
+              <w:t>٧ أيام</w:t>
+            </w:r>
+          </w:p>
+        </w:tc>
+        <w:tc>
+          <w:tcPr>
+            <w:tcW w:type="dxa" w:w="1973"/>
+            <w:vAlign w:val="center"/>
+          </w:tcPr>
+          <w:p>
+            <w:pPr>
+              <w:keepNext/>
+              <w:bidi w:val="1"/>
+              <w:spacing w:before="100" w:after="100"/>
+              <w:jc w:val="right"/>
+            </w:pPr>
+            <w:r>
+              <w:rPr>
+                <w:rFonts w:ascii="Arial" w:hAnsi="Arial" w:cs="Arial" w:eastAsia="Arial"/>
+                <w:b w:val="0"/>
+                <w:color w:val="26343B"/>
+                <w:sz w:val="21"/>
+                <w:rtl w:val="1"/>
+                <w:lang w:bidi="ar-EG"/>
+                <w:szCs w:val="21"/>
+                <w:bCs w:val="0"/>
+              </w:rPr>
+              <w:t>١٬٠٠٠ جنيه</w:t>
+            </w:r>
+          </w:p>
+        </w:tc>
+        <w:tc>
+          <w:tcPr>
+            <w:tcW w:type="dxa" w:w="1973"/>
+            <w:vAlign w:val="center"/>
+          </w:tcPr>
+          <w:p>
+            <w:pPr>
+              <w:keepNext/>
+              <w:bidi w:val="1"/>
+              <w:spacing w:before="100" w:after="100"/>
+              <w:jc w:val="right"/>
+            </w:pPr>
+            <w:r>
+              <w:rPr>
+                <w:rFonts w:ascii="Arial" w:hAnsi="Arial" w:cs="Arial" w:eastAsia="Arial"/>
+                <w:b w:val="0"/>
+                <w:color w:val="26343B"/>
+                <w:sz w:val="21"/>
+                <w:rtl w:val="1"/>
+                <w:lang w:bidi="ar-EG"/>
+                <w:szCs w:val="21"/>
+                <w:bCs w:val="0"/>
+              </w:rPr>
+              <w:t>٧٬٠٠٠ جنيه</w:t>
+            </w:r>
+          </w:p>
+        </w:tc>
+      </w:tr>
+      <w:tr>
+        <w:trPr>
+          <w:cantSplit/>
+        </w:trPr>
+        <w:tc>
+          <w:tcPr>
+            <w:tcW w:type="dxa" w:w="1973"/>
+            <w:vAlign w:val="center"/>
+          </w:tcPr>
+          <w:p>
+            <w:pPr>
+              <w:keepNext/>
+              <w:bidi w:val="1"/>
+              <w:spacing w:before="100" w:after="100"/>
+              <w:jc w:val="right"/>
+            </w:pPr>
+            <w:r>
+              <w:rPr>
+                <w:rFonts w:ascii="Arial" w:hAnsi="Arial" w:cs="Arial" w:eastAsia="Arial"/>
+                <w:b w:val="0"/>
+                <w:color w:val="26343B"/>
+                <w:sz w:val="21"/>
+                <w:rtl w:val="1"/>
+                <w:lang w:bidi="ar-EG"/>
+                <w:szCs w:val="21"/>
+                <w:bCs w:val="0"/>
+              </w:rPr>
+              <w:t>إعلانات ليدز</w:t>
+            </w:r>
+          </w:p>
+        </w:tc>
+        <w:tc>
+          <w:tcPr>
+            <w:tcW w:type="dxa" w:w="1973"/>
+            <w:vAlign w:val="center"/>
+          </w:tcPr>
+          <w:p>
+            <w:pPr>
+              <w:keepNext/>
+              <w:bidi w:val="1"/>
+              <w:spacing w:before="100" w:after="100"/>
+              <w:jc w:val="right"/>
+            </w:pPr>
+            <w:r>
+              <w:rPr>
+                <w:rFonts w:ascii="Arial" w:hAnsi="Arial" w:cs="Arial" w:eastAsia="Arial"/>
+                <w:b w:val="0"/>
+                <w:color w:val="26343B"/>
+                <w:sz w:val="21"/>
+                <w:rtl w:val="1"/>
+                <w:lang w:bidi="ar-EG"/>
+                <w:szCs w:val="21"/>
+                <w:bCs w:val="0"/>
+              </w:rPr>
+              <w:t>اليوم ٨–٣٠</w:t>
+            </w:r>
+          </w:p>
+        </w:tc>
+        <w:tc>
+          <w:tcPr>
+            <w:tcW w:type="dxa" w:w="1973"/>
+            <w:vAlign w:val="center"/>
+          </w:tcPr>
+          <w:p>
+            <w:pPr>
+              <w:keepNext/>
+              <w:bidi w:val="1"/>
+              <w:spacing w:before="100" w:after="100"/>
+              <w:jc w:val="right"/>
+            </w:pPr>
+            <w:r>
+              <w:rPr>
+                <w:rFonts w:ascii="Arial" w:hAnsi="Arial" w:cs="Arial" w:eastAsia="Arial"/>
+                <w:b w:val="0"/>
+                <w:color w:val="26343B"/>
+                <w:sz w:val="21"/>
+                <w:rtl w:val="1"/>
+                <w:lang w:bidi="ar-EG"/>
+                <w:szCs w:val="21"/>
+                <w:bCs w:val="0"/>
+              </w:rPr>
+              <w:t>٢٣ يوم</w:t>
+            </w:r>
+          </w:p>
+        </w:tc>
+        <w:tc>
+          <w:tcPr>
+            <w:tcW w:type="dxa" w:w="1973"/>
+            <w:vAlign w:val="center"/>
+          </w:tcPr>
+          <w:p>
+            <w:pPr>
+              <w:keepNext/>
+              <w:bidi w:val="1"/>
+              <w:spacing w:before="100" w:after="100"/>
+              <w:jc w:val="right"/>
+            </w:pPr>
+            <w:r>
+              <w:rPr>
+                <w:rFonts w:ascii="Arial" w:hAnsi="Arial" w:cs="Arial" w:eastAsia="Arial"/>
+                <w:b w:val="0"/>
+                <w:color w:val="26343B"/>
+                <w:sz w:val="21"/>
+                <w:rtl w:val="1"/>
+                <w:lang w:bidi="ar-EG"/>
+                <w:szCs w:val="21"/>
+                <w:bCs w:val="0"/>
+              </w:rPr>
+              <w:t>١٬٠٠٠ جنيه</w:t>
+            </w:r>
+          </w:p>
+        </w:tc>
+        <w:tc>
+          <w:tcPr>
+            <w:tcW w:type="dxa" w:w="1973"/>
+            <w:vAlign w:val="center"/>
+          </w:tcPr>
+          <w:p>
+            <w:pPr>
+              <w:keepNext/>
+              <w:bidi w:val="1"/>
+              <w:spacing w:before="100" w:after="100"/>
+              <w:jc w:val="right"/>
+            </w:pPr>
+            <w:r>
+              <w:rPr>
+                <w:rFonts w:ascii="Arial" w:hAnsi="Arial" w:cs="Arial" w:eastAsia="Arial"/>
+                <w:b w:val="0"/>
+                <w:color w:val="26343B"/>
+                <w:sz w:val="21"/>
+                <w:rtl w:val="1"/>
+                <w:lang w:bidi="ar-EG"/>
+                <w:szCs w:val="21"/>
+                <w:bCs w:val="0"/>
+              </w:rPr>
+              <w:t>٢٣٬٠٠٠ جنيه</w:t>
+            </w:r>
+          </w:p>
+        </w:tc>
+      </w:tr>
+      <w:tr>
+        <w:trPr>
+          <w:cantSplit/>
+        </w:trPr>
+        <w:tc>
+          <w:tcPr>
+            <w:tcW w:type="dxa" w:w="1973"/>
+            <w:vAlign w:val="center"/>
+          </w:tcPr>
+          <w:p>
+            <w:pPr>
+              <w:bidi w:val="1"/>
+              <w:spacing w:before="100" w:after="100"/>
+              <w:jc w:val="right"/>
+            </w:pPr>
+            <w:r>
+              <w:rPr>
+                <w:rFonts w:ascii="Arial" w:hAnsi="Arial" w:cs="Arial" w:eastAsia="Arial"/>
+                <w:b w:val="0"/>
+                <w:color w:val="26343B"/>
+                <w:sz w:val="21"/>
+                <w:rtl w:val="1"/>
+                <w:lang w:bidi="ar-EG"/>
+                <w:szCs w:val="21"/>
+                <w:bCs w:val="0"/>
+              </w:rPr>
+              <w:t>الإجمالي</w:t>
+            </w:r>
+          </w:p>
+        </w:tc>
+        <w:tc>
+          <w:tcPr>
+            <w:tcW w:type="dxa" w:w="1973"/>
+            <w:vAlign w:val="center"/>
+          </w:tcPr>
+          <w:p>
+            <w:pPr>
+              <w:bidi w:val="1"/>
+              <w:spacing w:before="100" w:after="100"/>
+              <w:jc w:val="right"/>
+            </w:pPr>
+            <w:r>
+              <w:rPr>
+                <w:rFonts w:ascii="Arial" w:hAnsi="Arial" w:cs="Arial" w:eastAsia="Arial"/>
+                <w:b w:val="0"/>
+                <w:color w:val="26343B"/>
+                <w:sz w:val="21"/>
+                <w:rtl w:val="1"/>
+                <w:lang w:bidi="ar-EG"/>
+                <w:szCs w:val="21"/>
+                <w:bCs w:val="0"/>
+              </w:rPr>
+              <w:t>شهر تخطيطي ٣٠ يوم</w:t>
+            </w:r>
+          </w:p>
+        </w:tc>
+        <w:tc>
+          <w:tcPr>
+            <w:tcW w:type="dxa" w:w="1973"/>
+            <w:vAlign w:val="center"/>
+          </w:tcPr>
+          <w:p>
+            <w:pPr>
+              <w:bidi w:val="1"/>
+              <w:spacing w:before="100" w:after="100"/>
+              <w:jc w:val="right"/>
+            </w:pPr>
+            <w:r>
+              <w:rPr>
+                <w:rFonts w:ascii="Arial" w:hAnsi="Arial" w:cs="Arial" w:eastAsia="Arial"/>
+                <w:b w:val="0"/>
+                <w:color w:val="26343B"/>
+                <w:sz w:val="21"/>
+                <w:rtl w:val="1"/>
+                <w:lang w:bidi="ar-EG"/>
+                <w:szCs w:val="21"/>
+                <w:bCs w:val="0"/>
+              </w:rPr>
+              <w:t>٣٠ يوم</w:t>
+            </w:r>
+          </w:p>
+        </w:tc>
+        <w:tc>
+          <w:tcPr>
+            <w:tcW w:type="dxa" w:w="1973"/>
+            <w:vAlign w:val="center"/>
+          </w:tcPr>
+          <w:p>
+            <w:pPr>
+              <w:bidi w:val="1"/>
+              <w:spacing w:before="100" w:after="100"/>
+              <w:jc w:val="right"/>
+            </w:pPr>
+            <w:r>
+              <w:rPr>
+                <w:rFonts w:ascii="Arial" w:hAnsi="Arial" w:cs="Arial" w:eastAsia="Arial"/>
+                <w:b w:val="0"/>
+                <w:color w:val="26343B"/>
+                <w:sz w:val="21"/>
+                <w:rtl w:val="1"/>
+                <w:lang w:bidi="ar-EG"/>
+                <w:szCs w:val="21"/>
+                <w:bCs w:val="0"/>
+              </w:rPr>
+              <w:t>١٬٠٠٠ جنيه</w:t>
+            </w:r>
+          </w:p>
+        </w:tc>
+        <w:tc>
+          <w:tcPr>
+            <w:tcW w:type="dxa" w:w="1973"/>
+            <w:vAlign w:val="center"/>
+          </w:tcPr>
+          <w:p>
+            <w:pPr>
+              <w:bidi w:val="1"/>
+              <w:spacing w:before="100" w:after="100"/>
+              <w:jc w:val="right"/>
+            </w:pPr>
+            <w:r>
+              <w:rPr>
+                <w:rFonts w:ascii="Arial" w:hAnsi="Arial" w:cs="Arial" w:eastAsia="Arial"/>
+                <w:b w:val="0"/>
+                <w:color w:val="26343B"/>
+                <w:sz w:val="21"/>
+                <w:rtl w:val="1"/>
+                <w:lang w:bidi="ar-EG"/>
+                <w:szCs w:val="21"/>
+                <w:bCs w:val="0"/>
+              </w:rPr>
+              <w:t>٣٠٬٠٠٠ جنيه</w:t>
+            </w:r>
+          </w:p>
+        </w:tc>
+      </w:tr>
+    </w:tbl>
+    <w:p>
+      <w:pPr>
+        <w:spacing w:after="40"/>
+      </w:pPr>
+    </w:p>
+    <w:p>
+      <w:pPr>
+        <w:bidi w:val="1"/>
+        <w:jc w:val="right"/>
+      </w:pPr>
+      <w:r>
+        <w:rPr>
+          <w:rFonts w:ascii="Arial" w:hAnsi="Arial" w:cs="Arial" w:eastAsia="Arial"/>
+          <w:b w:val="0"/>
+          <w:sz w:val="24"/>
+          <w:rtl w:val="1"/>
+          <w:lang w:bidi="ar-EG"/>
+          <w:szCs w:val="24"/>
+          <w:bCs w:val="0"/>
+        </w:rPr>
+        <w:t>الخطة محسوبة على ٣٠ يوم، مش مرتبطة بشهر تقويمي معين. المبلغ مخصص لشراء المساحات الإعلانية؛ أتعاب الإدارة والتصوير والإنتاج وأي رسوم أو ضرائب دفع منفصلة حسب الاتفاق والفوترة، ومش مدرجة في المبلغ ده.</w:t>
+      </w:r>
+    </w:p>
+    <w:p>
+      <w:pPr>
+        <w:bidi w:val="1"/>
+        <w:jc w:val="right"/>
+      </w:pPr>
+      <w:r>
+        <w:rPr>
+          <w:rFonts w:ascii="Arial" w:hAnsi="Arial" w:cs="Arial" w:eastAsia="Arial"/>
+          <w:b w:val="0"/>
+          <w:sz w:val="24"/>
+          <w:rtl w:val="1"/>
+          <w:lang w:bidi="ar-EG"/>
+          <w:szCs w:val="24"/>
+          <w:bCs w:val="0"/>
+        </w:rPr>
+        <w:t>١٬٠٠٠ جنيه هو متوسط الصرف اليومي المستهدف. نضبط مواعيد بداية ونهاية كل مرحلة وحدود ميزانيتها حسب أدوات المنصة، ونراجع الفوترة والصرف يوميًا عشان نحافظ على سقف ٧٬٠٠٠ + ٢٣٬٠٠٠ جنيه. تذبذب الصرف اليومي على المنصة مايتحولش لزيادة في الميزانية المخططة.</w:t>
+      </w:r>
+    </w:p>
+    <w:p>
+      <w:pPr>
+        <w:pStyle w:val="Heading2"/>
+        <w:keepNext/>
+        <w:bidi w:val="1"/>
+        <w:jc w:val="right"/>
+      </w:pPr>
+      <w:r>
+        <w:rPr>
+          <w:rFonts w:ascii="Arial" w:hAnsi="Arial" w:cs="Arial" w:eastAsia="Arial"/>
+          <w:b/>
+          <w:color w:val="216575"/>
+          <w:sz w:val="28"/>
+          <w:rtl w:val="1"/>
+          <w:lang w:bidi="ar-EG"/>
+          <w:szCs w:val="28"/>
+          <w:bCs w:val="1"/>
+        </w:rPr>
+        <w:t>المرحلة الأولى: رسائل — اليوم ١ لليوم ٧</w:t>
+      </w:r>
+    </w:p>
+    <w:p>
+      <w:pPr>
+        <w:bidi w:val="1"/>
+        <w:spacing w:after="80"/>
+        <w:ind w:right="170"/>
+        <w:jc w:val="right"/>
+      </w:pPr>
+      <w:r>
+        <w:rPr>
+          <w:rFonts w:ascii="Arial" w:hAnsi="Arial" w:cs="Arial" w:eastAsia="Arial"/>
+          <w:b w:val="0"/>
+          <w:sz w:val="24"/>
+          <w:rtl w:val="1"/>
+          <w:lang w:bidi="ar-EG"/>
+          <w:szCs w:val="24"/>
+          <w:bCs w:val="0"/>
+        </w:rPr>
+        <w:t>•  نوجّه الإعلان لمحادثة على واتساب أو ماسنجر حسب قناة الرد الجاهزة عند الفريق.</w:t>
+      </w:r>
+    </w:p>
+    <w:p>
+      <w:pPr>
+        <w:bidi w:val="1"/>
+        <w:spacing w:after="80"/>
+        <w:ind w:right="170"/>
+        <w:jc w:val="right"/>
+      </w:pPr>
+      <w:r>
+        <w:rPr>
+          <w:rFonts w:ascii="Arial" w:hAnsi="Arial" w:cs="Arial" w:eastAsia="Arial"/>
+          <w:b w:val="0"/>
+          <w:sz w:val="24"/>
+          <w:rtl w:val="1"/>
+          <w:lang w:bidi="ar-EG"/>
+          <w:szCs w:val="24"/>
+          <w:bCs w:val="0"/>
+        </w:rPr>
+        <w:t>•  نبدأ بإبداعات محدودة تختبر الموقع، التنفيذ، والسعر والمقدم، بدل تشتيت الميزانية.</w:t>
+      </w:r>
+    </w:p>
+    <w:p>
+      <w:pPr>
+        <w:bidi w:val="1"/>
+        <w:spacing w:after="80"/>
+        <w:ind w:right="170"/>
+        <w:jc w:val="right"/>
+      </w:pPr>
+      <w:r>
+        <w:rPr>
+          <w:rFonts w:ascii="Arial" w:hAnsi="Arial" w:cs="Arial" w:eastAsia="Arial"/>
+          <w:b w:val="0"/>
+          <w:sz w:val="24"/>
+          <w:rtl w:val="1"/>
+          <w:lang w:bidi="ar-EG"/>
+          <w:szCs w:val="24"/>
+          <w:bCs w:val="0"/>
+        </w:rPr>
+        <w:t>•  نوضح من البداية السعر ١٫٨ مليون، المقدم ٥٤٠ ألف، الباقي على سنتين، وإن المشروع تحت الإنشاء.</w:t>
+      </w:r>
+    </w:p>
+    <w:p>
+      <w:pPr>
+        <w:bidi w:val="1"/>
+        <w:spacing w:after="80"/>
+        <w:ind w:right="170"/>
+        <w:jc w:val="right"/>
+      </w:pPr>
+      <w:r>
+        <w:rPr>
+          <w:rFonts w:ascii="Arial" w:hAnsi="Arial" w:cs="Arial" w:eastAsia="Arial"/>
+          <w:b w:val="0"/>
+          <w:sz w:val="24"/>
+          <w:rtl w:val="1"/>
+          <w:lang w:bidi="ar-EG"/>
+          <w:szCs w:val="24"/>
+          <w:bCs w:val="0"/>
+        </w:rPr>
+        <w:t>•  نسجّل هدف الشراء، القدرة المبدئية على السداد، الاعتراضات، وطلب المعاينة لكل عميل.</w:t>
+      </w:r>
+    </w:p>
+    <w:p>
+      <w:pPr>
+        <w:bidi w:val="1"/>
+        <w:spacing w:after="80"/>
+        <w:ind w:right="170"/>
+        <w:jc w:val="right"/>
+      </w:pPr>
+      <w:r>
+        <w:rPr>
+          <w:rFonts w:ascii="Arial" w:hAnsi="Arial" w:cs="Arial" w:eastAsia="Arial"/>
+          <w:b w:val="0"/>
+          <w:sz w:val="24"/>
+          <w:rtl w:val="1"/>
+          <w:lang w:bidi="ar-EG"/>
+          <w:szCs w:val="24"/>
+          <w:bCs w:val="0"/>
+        </w:rPr>
+        <w:t>•  في نهاية اليوم ٧ نحدد الإبداعات اللي جابت استفسارات مؤهلة، ونستخدم الأسئلة والاعتراضات لتحسين فورم الليدز.</w:t>
+      </w:r>
+    </w:p>
+    <w:p>
+      <w:pPr>
+        <w:pStyle w:val="Heading2"/>
+        <w:keepNext/>
+        <w:bidi w:val="1"/>
+        <w:jc w:val="right"/>
+      </w:pPr>
+      <w:r>
+        <w:rPr>
+          <w:rFonts w:ascii="Arial" w:hAnsi="Arial" w:cs="Arial" w:eastAsia="Arial"/>
+          <w:b/>
+          <w:color w:val="216575"/>
+          <w:sz w:val="28"/>
+          <w:rtl w:val="1"/>
+          <w:lang w:bidi="ar-EG"/>
+          <w:szCs w:val="28"/>
+          <w:bCs w:val="1"/>
+        </w:rPr>
+        <w:t>المرحلة التانية: ليدز — اليوم ٨ لليوم ٣٠</w:t>
+      </w:r>
+    </w:p>
+    <w:p>
+      <w:pPr>
+        <w:bidi w:val="1"/>
+        <w:spacing w:after="80"/>
+        <w:ind w:right="170"/>
+        <w:jc w:val="right"/>
+      </w:pPr>
+      <w:r>
+        <w:rPr>
+          <w:rFonts w:ascii="Arial" w:hAnsi="Arial" w:cs="Arial" w:eastAsia="Arial"/>
+          <w:b w:val="0"/>
+          <w:sz w:val="24"/>
+          <w:rtl w:val="1"/>
+          <w:lang w:bidi="ar-EG"/>
+          <w:szCs w:val="24"/>
+          <w:bCs w:val="0"/>
+        </w:rPr>
+        <w:t>•  نوقف إنفاق الرسائل بنهاية الأسبوع الأول، ونحوّل الـ٢٣٬٠٠٠ جنيه المتبقية لحملات ليدز.</w:t>
+      </w:r>
+    </w:p>
+    <w:p>
+      <w:pPr>
+        <w:bidi w:val="1"/>
+        <w:spacing w:after="80"/>
+        <w:ind w:right="170"/>
+        <w:jc w:val="right"/>
+      </w:pPr>
+      <w:r>
+        <w:rPr>
+          <w:rFonts w:ascii="Arial" w:hAnsi="Arial" w:cs="Arial" w:eastAsia="Arial"/>
+          <w:b w:val="0"/>
+          <w:sz w:val="24"/>
+          <w:rtl w:val="1"/>
+          <w:lang w:bidi="ar-EG"/>
+          <w:szCs w:val="24"/>
+          <w:bCs w:val="0"/>
+        </w:rPr>
+        <w:t>•  نستخدم نموذج بيانات داخل المنصة، مع خطوة مراجعة قبل الإرسال لو الخاصية متاحة، ونجهزه خلال أول أسبوع عشان التحويل يبدأ من اليوم ٨.</w:t>
+      </w:r>
+    </w:p>
+    <w:p>
+      <w:pPr>
+        <w:bidi w:val="1"/>
+        <w:spacing w:after="80"/>
+        <w:ind w:right="170"/>
+        <w:jc w:val="right"/>
+      </w:pPr>
+      <w:r>
+        <w:rPr>
+          <w:rFonts w:ascii="Arial" w:hAnsi="Arial" w:cs="Arial" w:eastAsia="Arial"/>
+          <w:b w:val="0"/>
+          <w:sz w:val="24"/>
+          <w:rtl w:val="1"/>
+          <w:lang w:bidi="ar-EG"/>
+          <w:szCs w:val="24"/>
+          <w:bCs w:val="0"/>
+        </w:rPr>
+        <w:t>•  نكتب السعر والمقدم والموقع وحالة الإنشاء في الإعلان ومقدمة الفورم؛ العميل يعرف العرض قبل ما يسجل.</w:t>
+      </w:r>
+    </w:p>
+    <w:p>
+      <w:pPr>
+        <w:bidi w:val="1"/>
+        <w:spacing w:after="80"/>
+        <w:ind w:right="170"/>
+        <w:jc w:val="right"/>
+      </w:pPr>
+      <w:r>
+        <w:rPr>
+          <w:rFonts w:ascii="Arial" w:hAnsi="Arial" w:cs="Arial" w:eastAsia="Arial"/>
+          <w:b w:val="0"/>
+          <w:sz w:val="24"/>
+          <w:rtl w:val="1"/>
+          <w:lang w:bidi="ar-EG"/>
+          <w:szCs w:val="24"/>
+          <w:bCs w:val="0"/>
+        </w:rPr>
+        <w:t>•  نستخدم أسئلة تأهيل قصيرة، ونجمع الاسم ورقم الموبايل، مع توضيح إن فريق المبيعات هيتواصل بخصوص المشروع.</w:t>
+      </w:r>
+    </w:p>
+    <w:p>
+      <w:pPr>
+        <w:bidi w:val="1"/>
+        <w:spacing w:after="80"/>
+        <w:ind w:right="170"/>
+        <w:jc w:val="right"/>
+      </w:pPr>
+      <w:r>
+        <w:rPr>
+          <w:rFonts w:ascii="Arial" w:hAnsi="Arial" w:cs="Arial" w:eastAsia="Arial"/>
+          <w:b w:val="0"/>
+          <w:sz w:val="24"/>
+          <w:rtl w:val="1"/>
+          <w:lang w:bidi="ar-EG"/>
+          <w:szCs w:val="24"/>
+          <w:bCs w:val="0"/>
+        </w:rPr>
+        <w:t>•  بعد الإرسال نظهر رسالة واضحة بالخطوة الجاية: تواصل المبيعات لترشيح وحدة وتحديد معاينة مناسبة.</w:t>
+      </w:r>
+    </w:p>
+    <w:p>
+      <w:pPr>
+        <w:pStyle w:val="Heading2"/>
+        <w:keepNext/>
+        <w:bidi w:val="1"/>
+        <w:jc w:val="right"/>
+      </w:pPr>
+      <w:r>
+        <w:rPr>
+          <w:rFonts w:ascii="Arial" w:hAnsi="Arial" w:cs="Arial" w:eastAsia="Arial"/>
+          <w:b/>
+          <w:color w:val="216575"/>
+          <w:sz w:val="28"/>
+          <w:rtl w:val="1"/>
+          <w:lang w:bidi="ar-EG"/>
+          <w:szCs w:val="28"/>
+          <w:bCs w:val="1"/>
+        </w:rPr>
+        <w:t>أسئلة نموذج الليدز المقترحة</w:t>
+      </w:r>
+    </w:p>
+    <w:tbl>
+      <w:tblPr>
+        <w:tblStyle w:val="TableGrid"/>
+        <w:tblW w:type="auto" w:w="0"/>
+        <w:jc w:val="center"/>
+        <w:tblLook w:firstColumn="1" w:firstRow="1" w:lastColumn="0" w:lastRow="0" w:noHBand="0" w:noVBand="1" w:val="04A0"/>
+        <w:bidiVisual w:val="1"/>
+      </w:tblPr>
+      <w:tblGrid>
+        <w:gridCol w:w="4933"/>
+        <w:gridCol w:w="4933"/>
+      </w:tblGrid>
+      <w:tr>
+        <w:trPr>
+          <w:tblHeader/>
+          <w:cantSplit/>
+        </w:trPr>
+        <w:tc>
+          <w:tcPr>
+            <w:tcW w:type="dxa" w:w="4933"/>
+            <w:vAlign w:val="center"/>
+            <w:shd w:fill="163B4A"/>
+          </w:tcPr>
+          <w:p>
+            <w:pPr>
+              <w:keepNext/>
+              <w:bidi w:val="1"/>
+              <w:spacing w:before="100" w:after="100"/>
+              <w:jc w:val="right"/>
+            </w:pPr>
+            <w:r>
+              <w:rPr>
+                <w:rFonts w:ascii="Arial" w:hAnsi="Arial" w:cs="Arial" w:eastAsia="Arial"/>
+                <w:b/>
+                <w:color w:val="FFFFFF"/>
+                <w:sz w:val="21"/>
+                <w:rtl w:val="1"/>
+                <w:lang w:bidi="ar-EG"/>
+                <w:szCs w:val="21"/>
+                <w:bCs w:val="1"/>
+              </w:rPr>
+              <w:t>السؤال</w:t>
+            </w:r>
+          </w:p>
+        </w:tc>
+        <w:tc>
+          <w:tcPr>
+            <w:tcW w:type="dxa" w:w="4933"/>
+            <w:vAlign w:val="center"/>
+            <w:shd w:fill="163B4A"/>
+          </w:tcPr>
+          <w:p>
+            <w:pPr>
+              <w:keepNext/>
+              <w:bidi w:val="1"/>
+              <w:spacing w:before="100" w:after="100"/>
+              <w:jc w:val="right"/>
+            </w:pPr>
+            <w:r>
+              <w:rPr>
+                <w:rFonts w:ascii="Arial" w:hAnsi="Arial" w:cs="Arial" w:eastAsia="Arial"/>
+                <w:b/>
+                <w:color w:val="FFFFFF"/>
+                <w:sz w:val="21"/>
+                <w:rtl w:val="1"/>
+                <w:lang w:bidi="ar-EG"/>
+                <w:szCs w:val="21"/>
+                <w:bCs w:val="1"/>
+              </w:rPr>
+              <w:t>اختيارات أو إجابة مقترحة</w:t>
+            </w:r>
+          </w:p>
+        </w:tc>
+      </w:tr>
+      <w:tr>
+        <w:trPr>
+          <w:cantSplit/>
+        </w:trPr>
+        <w:tc>
+          <w:tcPr>
+            <w:tcW w:type="dxa" w:w="4933"/>
+            <w:vAlign w:val="center"/>
+          </w:tcPr>
+          <w:p>
+            <w:pPr>
+              <w:keepNext/>
+              <w:bidi w:val="1"/>
+              <w:spacing w:before="100" w:after="100"/>
+              <w:jc w:val="right"/>
+            </w:pPr>
+            <w:r>
+              <w:rPr>
+                <w:rFonts w:ascii="Arial" w:hAnsi="Arial" w:cs="Arial" w:eastAsia="Arial"/>
+                <w:b w:val="0"/>
+                <w:color w:val="26343B"/>
+                <w:sz w:val="21"/>
+                <w:rtl w:val="1"/>
+                <w:lang w:bidi="ar-EG"/>
+                <w:szCs w:val="21"/>
+                <w:bCs w:val="0"/>
+              </w:rPr>
+              <w:t>اسمك ورقم الموبايل؟</w:t>
+            </w:r>
+          </w:p>
+        </w:tc>
+        <w:tc>
+          <w:tcPr>
+            <w:tcW w:type="dxa" w:w="4933"/>
+            <w:vAlign w:val="center"/>
+          </w:tcPr>
+          <w:p>
+            <w:pPr>
+              <w:keepNext/>
+              <w:bidi w:val="1"/>
+              <w:spacing w:before="100" w:after="100"/>
+              <w:jc w:val="right"/>
+            </w:pPr>
+            <w:r>
+              <w:rPr>
+                <w:rFonts w:ascii="Arial" w:hAnsi="Arial" w:cs="Arial" w:eastAsia="Arial"/>
+                <w:b w:val="0"/>
+                <w:color w:val="26343B"/>
+                <w:sz w:val="21"/>
+                <w:rtl w:val="1"/>
+                <w:lang w:bidi="ar-EG"/>
+                <w:szCs w:val="21"/>
+                <w:bCs w:val="0"/>
+              </w:rPr>
+              <w:t>اسم + رقم صالح للتواصل.</w:t>
+            </w:r>
+          </w:p>
+        </w:tc>
+      </w:tr>
+      <w:tr>
+        <w:trPr>
+          <w:cantSplit/>
+        </w:trPr>
+        <w:tc>
+          <w:tcPr>
+            <w:tcW w:type="dxa" w:w="4933"/>
+            <w:vAlign w:val="center"/>
+          </w:tcPr>
+          <w:p>
+            <w:pPr>
+              <w:keepNext/>
+              <w:bidi w:val="1"/>
+              <w:spacing w:before="100" w:after="100"/>
+              <w:jc w:val="right"/>
+            </w:pPr>
+            <w:r>
+              <w:rPr>
+                <w:rFonts w:ascii="Arial" w:hAnsi="Arial" w:cs="Arial" w:eastAsia="Arial"/>
+                <w:b w:val="0"/>
+                <w:color w:val="26343B"/>
+                <w:sz w:val="21"/>
+                <w:rtl w:val="1"/>
+                <w:lang w:bidi="ar-EG"/>
+                <w:szCs w:val="21"/>
+                <w:bCs w:val="0"/>
+              </w:rPr>
+              <w:t>بتشتري ليه؟</w:t>
+            </w:r>
+          </w:p>
+        </w:tc>
+        <w:tc>
+          <w:tcPr>
+            <w:tcW w:type="dxa" w:w="4933"/>
+            <w:vAlign w:val="center"/>
+          </w:tcPr>
+          <w:p>
+            <w:pPr>
+              <w:keepNext/>
+              <w:bidi w:val="1"/>
+              <w:spacing w:before="100" w:after="100"/>
+              <w:jc w:val="right"/>
+            </w:pPr>
+            <w:r>
+              <w:rPr>
+                <w:rFonts w:ascii="Arial" w:hAnsi="Arial" w:cs="Arial" w:eastAsia="Arial"/>
+                <w:b w:val="0"/>
+                <w:color w:val="26343B"/>
+                <w:sz w:val="21"/>
+                <w:rtl w:val="1"/>
+                <w:lang w:bidi="ar-EG"/>
+                <w:szCs w:val="21"/>
+                <w:bCs w:val="0"/>
+              </w:rPr>
+              <w:t>سكن / استثمار وإعادة بيع / تأجير مستقبلًا.</w:t>
+            </w:r>
+          </w:p>
+        </w:tc>
+      </w:tr>
+      <w:tr>
+        <w:trPr>
+          <w:cantSplit/>
+        </w:trPr>
+        <w:tc>
+          <w:tcPr>
+            <w:tcW w:type="dxa" w:w="4933"/>
+            <w:vAlign w:val="center"/>
+          </w:tcPr>
+          <w:p>
+            <w:pPr>
+              <w:keepNext/>
+              <w:bidi w:val="1"/>
+              <w:spacing w:before="100" w:after="100"/>
+              <w:jc w:val="right"/>
+            </w:pPr>
+            <w:r>
+              <w:rPr>
+                <w:rFonts w:ascii="Arial" w:hAnsi="Arial" w:cs="Arial" w:eastAsia="Arial"/>
+                <w:b w:val="0"/>
+                <w:color w:val="26343B"/>
+                <w:sz w:val="21"/>
+                <w:rtl w:val="1"/>
+                <w:lang w:bidi="ar-EG"/>
+                <w:szCs w:val="21"/>
+                <w:bCs w:val="0"/>
+              </w:rPr>
+              <w:t>المشروع في الحي الثالث وتحت الإنشاء، ده مناسب ليك؟</w:t>
+            </w:r>
+          </w:p>
+        </w:tc>
+        <w:tc>
+          <w:tcPr>
+            <w:tcW w:type="dxa" w:w="4933"/>
+            <w:vAlign w:val="center"/>
+          </w:tcPr>
+          <w:p>
+            <w:pPr>
+              <w:keepNext/>
+              <w:bidi w:val="1"/>
+              <w:spacing w:before="100" w:after="100"/>
+              <w:jc w:val="right"/>
+            </w:pPr>
+            <w:r>
+              <w:rPr>
+                <w:rFonts w:ascii="Arial" w:hAnsi="Arial" w:cs="Arial" w:eastAsia="Arial"/>
+                <w:b w:val="0"/>
+                <w:color w:val="26343B"/>
+                <w:sz w:val="21"/>
+                <w:rtl w:val="1"/>
+                <w:lang w:bidi="ar-EG"/>
+                <w:szCs w:val="21"/>
+                <w:bCs w:val="0"/>
+              </w:rPr>
+              <w:t>مناسب / محتاج تفاصيل التسليم الأول / مش مناسب حاليًا.</w:t>
+            </w:r>
+          </w:p>
+        </w:tc>
+      </w:tr>
+      <w:tr>
+        <w:trPr>
+          <w:cantSplit/>
+        </w:trPr>
+        <w:tc>
+          <w:tcPr>
+            <w:tcW w:type="dxa" w:w="4933"/>
+            <w:vAlign w:val="center"/>
+          </w:tcPr>
+          <w:p>
+            <w:pPr>
+              <w:keepNext/>
+              <w:bidi w:val="1"/>
+              <w:spacing w:before="100" w:after="100"/>
+              <w:jc w:val="right"/>
+            </w:pPr>
+            <w:r>
+              <w:rPr>
+                <w:rFonts w:ascii="Arial" w:hAnsi="Arial" w:cs="Arial" w:eastAsia="Arial"/>
+                <w:b w:val="0"/>
+                <w:color w:val="26343B"/>
+                <w:sz w:val="21"/>
+                <w:rtl w:val="1"/>
+                <w:lang w:bidi="ar-EG"/>
+                <w:szCs w:val="21"/>
+                <w:bCs w:val="0"/>
+              </w:rPr>
+              <w:t>مقدم ٥٤٠ ألف والباقي على سنتين، النظام مناسب مبدئيًا؟</w:t>
+            </w:r>
+          </w:p>
+        </w:tc>
+        <w:tc>
+          <w:tcPr>
+            <w:tcW w:type="dxa" w:w="4933"/>
+            <w:vAlign w:val="center"/>
+          </w:tcPr>
+          <w:p>
+            <w:pPr>
+              <w:keepNext/>
+              <w:bidi w:val="1"/>
+              <w:spacing w:before="100" w:after="100"/>
+              <w:jc w:val="right"/>
+            </w:pPr>
+            <w:r>
+              <w:rPr>
+                <w:rFonts w:ascii="Arial" w:hAnsi="Arial" w:cs="Arial" w:eastAsia="Arial"/>
+                <w:b w:val="0"/>
+                <w:color w:val="26343B"/>
+                <w:sz w:val="21"/>
+                <w:rtl w:val="1"/>
+                <w:lang w:bidi="ar-EG"/>
+                <w:szCs w:val="21"/>
+                <w:bCs w:val="0"/>
+              </w:rPr>
+              <w:t>مناسب / محتاج جدول الأقساط الأول / محتاج نظام مختلف.</w:t>
+            </w:r>
+          </w:p>
+        </w:tc>
+      </w:tr>
+      <w:tr>
+        <w:trPr>
+          <w:cantSplit/>
+        </w:trPr>
+        <w:tc>
+          <w:tcPr>
+            <w:tcW w:type="dxa" w:w="4933"/>
+            <w:vAlign w:val="center"/>
+          </w:tcPr>
+          <w:p>
+            <w:pPr>
+              <w:keepNext/>
+              <w:bidi w:val="1"/>
+              <w:spacing w:before="100" w:after="100"/>
+              <w:jc w:val="right"/>
+            </w:pPr>
+            <w:r>
+              <w:rPr>
+                <w:rFonts w:ascii="Arial" w:hAnsi="Arial" w:cs="Arial" w:eastAsia="Arial"/>
+                <w:b w:val="0"/>
+                <w:color w:val="26343B"/>
+                <w:sz w:val="21"/>
+                <w:rtl w:val="1"/>
+                <w:lang w:bidi="ar-EG"/>
+                <w:szCs w:val="21"/>
+                <w:bCs w:val="0"/>
+              </w:rPr>
+              <w:t>ناوي تاخد قرار الشراء خلال قد إيه؟</w:t>
+            </w:r>
+          </w:p>
+        </w:tc>
+        <w:tc>
+          <w:tcPr>
+            <w:tcW w:type="dxa" w:w="4933"/>
+            <w:vAlign w:val="center"/>
+          </w:tcPr>
+          <w:p>
+            <w:pPr>
+              <w:keepNext/>
+              <w:bidi w:val="1"/>
+              <w:spacing w:before="100" w:after="100"/>
+              <w:jc w:val="right"/>
+            </w:pPr>
+            <w:r>
+              <w:rPr>
+                <w:rFonts w:ascii="Arial" w:hAnsi="Arial" w:cs="Arial" w:eastAsia="Arial"/>
+                <w:b w:val="0"/>
+                <w:color w:val="26343B"/>
+                <w:sz w:val="21"/>
+                <w:rtl w:val="1"/>
+                <w:lang w:bidi="ar-EG"/>
+                <w:szCs w:val="21"/>
+                <w:bCs w:val="0"/>
+              </w:rPr>
+              <w:t>خلال شهر / من شهر لـ٣ شهور / لسه بقارن.</w:t>
+            </w:r>
+          </w:p>
+        </w:tc>
+      </w:tr>
+      <w:tr>
+        <w:trPr>
+          <w:cantSplit/>
+        </w:trPr>
+        <w:tc>
+          <w:tcPr>
+            <w:tcW w:type="dxa" w:w="4933"/>
+            <w:vAlign w:val="center"/>
+          </w:tcPr>
+          <w:p>
+            <w:pPr>
+              <w:bidi w:val="1"/>
+              <w:spacing w:before="100" w:after="100"/>
+              <w:jc w:val="right"/>
+            </w:pPr>
+            <w:r>
+              <w:rPr>
+                <w:rFonts w:ascii="Arial" w:hAnsi="Arial" w:cs="Arial" w:eastAsia="Arial"/>
+                <w:b w:val="0"/>
+                <w:color w:val="26343B"/>
+                <w:sz w:val="21"/>
+                <w:rtl w:val="1"/>
+                <w:lang w:bidi="ar-EG"/>
+                <w:szCs w:val="21"/>
+                <w:bCs w:val="0"/>
+              </w:rPr>
+              <w:t>أنسب وقت نتواصل معاك؟</w:t>
+            </w:r>
+          </w:p>
+        </w:tc>
+        <w:tc>
+          <w:tcPr>
+            <w:tcW w:type="dxa" w:w="4933"/>
+            <w:vAlign w:val="center"/>
+          </w:tcPr>
+          <w:p>
+            <w:pPr>
+              <w:bidi w:val="1"/>
+              <w:spacing w:before="100" w:after="100"/>
+              <w:jc w:val="right"/>
+            </w:pPr>
+            <w:r>
+              <w:rPr>
+                <w:rFonts w:ascii="Arial" w:hAnsi="Arial" w:cs="Arial" w:eastAsia="Arial"/>
+                <w:b w:val="0"/>
+                <w:color w:val="26343B"/>
+                <w:sz w:val="21"/>
+                <w:rtl w:val="1"/>
+                <w:lang w:bidi="ar-EG"/>
+                <w:szCs w:val="21"/>
+                <w:bCs w:val="0"/>
+              </w:rPr>
+              <w:t>اختياري: صباحًا / بعد الظهر / مساءً.</w:t>
+            </w:r>
+          </w:p>
+        </w:tc>
+      </w:tr>
+    </w:tbl>
+    <w:p>
+      <w:pPr>
+        <w:spacing w:after="40"/>
+      </w:pPr>
+    </w:p>
+    <w:p>
+      <w:pPr>
+        <w:bidi w:val="1"/>
+        <w:jc w:val="right"/>
+      </w:pPr>
+      <w:r>
+        <w:rPr>
+          <w:rFonts w:ascii="Arial" w:hAnsi="Arial" w:cs="Arial" w:eastAsia="Arial"/>
+          <w:b w:val="0"/>
+          <w:sz w:val="24"/>
+          <w:rtl w:val="1"/>
+          <w:lang w:bidi="ar-EG"/>
+          <w:szCs w:val="24"/>
+          <w:bCs w:val="0"/>
+        </w:rPr>
+        <w:t>الفورم أداة تأهيل مش ضمان إن كل الليدز جادة. نراجع البيانات بالتواصل الفعلي، وما نطلبش دخل تفصيلي أو مستندات مالية في النموذج. اختيار «محتاج تفاصيل» مايتحولش لرفض تلقائي لعميل ممكن يناسبه العرض.</w:t>
+      </w:r>
+    </w:p>
+    <w:p>
+      <w:pPr>
+        <w:pStyle w:val="Heading2"/>
+        <w:keepNext/>
+        <w:bidi w:val="1"/>
+        <w:jc w:val="right"/>
+      </w:pPr>
+      <w:r>
+        <w:rPr>
+          <w:rFonts w:ascii="Arial" w:hAnsi="Arial" w:cs="Arial" w:eastAsia="Arial"/>
+          <w:b/>
+          <w:color w:val="216575"/>
+          <w:sz w:val="28"/>
+          <w:rtl w:val="1"/>
+          <w:lang w:bidi="ar-EG"/>
+          <w:szCs w:val="28"/>
+          <w:bCs w:val="1"/>
+        </w:rPr>
+        <w:t>آلية فلترة ومتابعة العملاء</w:t>
+      </w:r>
+    </w:p>
+    <w:tbl>
+      <w:tblPr>
+        <w:tblStyle w:val="TableGrid"/>
+        <w:tblW w:type="auto" w:w="0"/>
+        <w:jc w:val="center"/>
+        <w:tblLook w:firstColumn="1" w:firstRow="1" w:lastColumn="0" w:lastRow="0" w:noHBand="0" w:noVBand="1" w:val="04A0"/>
+        <w:bidiVisual w:val="1"/>
+      </w:tblPr>
+      <w:tblGrid>
+        <w:gridCol w:w="3289"/>
+        <w:gridCol w:w="3289"/>
+        <w:gridCol w:w="3289"/>
+      </w:tblGrid>
+      <w:tr>
+        <w:trPr>
+          <w:tblHeader/>
+          <w:cantSplit/>
+        </w:trPr>
+        <w:tc>
+          <w:tcPr>
+            <w:tcW w:type="dxa" w:w="3289"/>
+            <w:vAlign w:val="center"/>
+            <w:shd w:fill="163B4A"/>
+          </w:tcPr>
+          <w:p>
+            <w:pPr>
+              <w:keepNext/>
+              <w:bidi w:val="1"/>
+              <w:spacing w:before="100" w:after="100"/>
+              <w:jc w:val="right"/>
+            </w:pPr>
+            <w:r>
+              <w:rPr>
+                <w:rFonts w:ascii="Arial" w:hAnsi="Arial" w:cs="Arial" w:eastAsia="Arial"/>
+                <w:b/>
+                <w:color w:val="FFFFFF"/>
+                <w:sz w:val="21"/>
+                <w:rtl w:val="1"/>
+                <w:lang w:bidi="ar-EG"/>
+                <w:szCs w:val="21"/>
+                <w:bCs w:val="1"/>
+              </w:rPr>
+              <w:t>التصنيف</w:t>
+            </w:r>
+          </w:p>
+        </w:tc>
+        <w:tc>
+          <w:tcPr>
+            <w:tcW w:type="dxa" w:w="3289"/>
+            <w:vAlign w:val="center"/>
+            <w:shd w:fill="163B4A"/>
+          </w:tcPr>
+          <w:p>
+            <w:pPr>
+              <w:keepNext/>
+              <w:bidi w:val="1"/>
+              <w:spacing w:before="100" w:after="100"/>
+              <w:jc w:val="right"/>
+            </w:pPr>
+            <w:r>
+              <w:rPr>
+                <w:rFonts w:ascii="Arial" w:hAnsi="Arial" w:cs="Arial" w:eastAsia="Arial"/>
+                <w:b/>
+                <w:color w:val="FFFFFF"/>
+                <w:sz w:val="21"/>
+                <w:rtl w:val="1"/>
+                <w:lang w:bidi="ar-EG"/>
+                <w:szCs w:val="21"/>
+                <w:bCs w:val="1"/>
+              </w:rPr>
+              <w:t>معناه</w:t>
+            </w:r>
+          </w:p>
+        </w:tc>
+        <w:tc>
+          <w:tcPr>
+            <w:tcW w:type="dxa" w:w="3289"/>
+            <w:vAlign w:val="center"/>
+            <w:shd w:fill="163B4A"/>
+          </w:tcPr>
+          <w:p>
+            <w:pPr>
+              <w:keepNext/>
+              <w:bidi w:val="1"/>
+              <w:spacing w:before="100" w:after="100"/>
+              <w:jc w:val="right"/>
+            </w:pPr>
+            <w:r>
+              <w:rPr>
+                <w:rFonts w:ascii="Arial" w:hAnsi="Arial" w:cs="Arial" w:eastAsia="Arial"/>
+                <w:b/>
+                <w:color w:val="FFFFFF"/>
+                <w:sz w:val="21"/>
+                <w:rtl w:val="1"/>
+                <w:lang w:bidi="ar-EG"/>
+                <w:szCs w:val="21"/>
+                <w:bCs w:val="1"/>
+              </w:rPr>
+              <w:t>الإجراء</w:t>
+            </w:r>
+          </w:p>
+        </w:tc>
+      </w:tr>
+      <w:tr>
+        <w:trPr>
+          <w:cantSplit/>
+        </w:trPr>
+        <w:tc>
+          <w:tcPr>
+            <w:tcW w:type="dxa" w:w="3289"/>
+            <w:vAlign w:val="center"/>
+          </w:tcPr>
+          <w:p>
+            <w:pPr>
+              <w:keepNext/>
+              <w:bidi w:val="1"/>
+              <w:spacing w:before="100" w:after="100"/>
+              <w:jc w:val="right"/>
+            </w:pPr>
+            <w:r>
+              <w:rPr>
+                <w:rFonts w:ascii="Arial" w:hAnsi="Arial" w:cs="Arial" w:eastAsia="Arial"/>
+                <w:b w:val="0"/>
+                <w:color w:val="26343B"/>
+                <w:sz w:val="21"/>
+                <w:rtl w:val="1"/>
+                <w:lang w:bidi="ar-EG"/>
+                <w:szCs w:val="21"/>
+                <w:bCs w:val="0"/>
+              </w:rPr>
+              <w:t>أولوية أ — مؤهل للمعاينة</w:t>
+            </w:r>
+          </w:p>
+        </w:tc>
+        <w:tc>
+          <w:tcPr>
+            <w:tcW w:type="dxa" w:w="3289"/>
+            <w:vAlign w:val="center"/>
+          </w:tcPr>
+          <w:p>
+            <w:pPr>
+              <w:keepNext/>
+              <w:bidi w:val="1"/>
+              <w:spacing w:before="100" w:after="100"/>
+              <w:jc w:val="right"/>
+            </w:pPr>
+            <w:r>
+              <w:rPr>
+                <w:rFonts w:ascii="Arial" w:hAnsi="Arial" w:cs="Arial" w:eastAsia="Arial"/>
+                <w:b w:val="0"/>
+                <w:color w:val="26343B"/>
+                <w:sz w:val="21"/>
+                <w:rtl w:val="1"/>
+                <w:lang w:bidi="ar-EG"/>
+                <w:szCs w:val="21"/>
+                <w:bCs w:val="0"/>
+              </w:rPr>
+              <w:t>تواصل صالح، الموقع وحالة المشروع مناسبين، والسداد مناسب مبدئيًا.</w:t>
+            </w:r>
+          </w:p>
+        </w:tc>
+        <w:tc>
+          <w:tcPr>
+            <w:tcW w:type="dxa" w:w="3289"/>
+            <w:vAlign w:val="center"/>
+          </w:tcPr>
+          <w:p>
+            <w:pPr>
+              <w:keepNext/>
+              <w:bidi w:val="1"/>
+              <w:spacing w:before="100" w:after="100"/>
+              <w:jc w:val="right"/>
+            </w:pPr>
+            <w:r>
+              <w:rPr>
+                <w:rFonts w:ascii="Arial" w:hAnsi="Arial" w:cs="Arial" w:eastAsia="Arial"/>
+                <w:b w:val="0"/>
+                <w:color w:val="26343B"/>
+                <w:sz w:val="21"/>
+                <w:rtl w:val="1"/>
+                <w:lang w:bidi="ar-EG"/>
+                <w:szCs w:val="21"/>
+                <w:bCs w:val="0"/>
+              </w:rPr>
+              <w:t>مكالمة سريعة، تأكيد الاحتياج، ثم تحديد معاينة.</w:t>
+            </w:r>
+          </w:p>
+        </w:tc>
+      </w:tr>
+      <w:tr>
+        <w:trPr>
+          <w:cantSplit/>
+        </w:trPr>
+        <w:tc>
+          <w:tcPr>
+            <w:tcW w:type="dxa" w:w="3289"/>
+            <w:vAlign w:val="center"/>
+          </w:tcPr>
+          <w:p>
+            <w:pPr>
+              <w:keepNext/>
+              <w:bidi w:val="1"/>
+              <w:spacing w:before="100" w:after="100"/>
+              <w:jc w:val="right"/>
+            </w:pPr>
+            <w:r>
+              <w:rPr>
+                <w:rFonts w:ascii="Arial" w:hAnsi="Arial" w:cs="Arial" w:eastAsia="Arial"/>
+                <w:b w:val="0"/>
+                <w:color w:val="26343B"/>
+                <w:sz w:val="21"/>
+                <w:rtl w:val="1"/>
+                <w:lang w:bidi="ar-EG"/>
+                <w:szCs w:val="21"/>
+                <w:bCs w:val="0"/>
+              </w:rPr>
+              <w:t>أولوية ب — محتاج توضيح أو وقت</w:t>
+            </w:r>
+          </w:p>
+        </w:tc>
+        <w:tc>
+          <w:tcPr>
+            <w:tcW w:type="dxa" w:w="3289"/>
+            <w:vAlign w:val="center"/>
+          </w:tcPr>
+          <w:p>
+            <w:pPr>
+              <w:keepNext/>
+              <w:bidi w:val="1"/>
+              <w:spacing w:before="100" w:after="100"/>
+              <w:jc w:val="right"/>
+            </w:pPr>
+            <w:r>
+              <w:rPr>
+                <w:rFonts w:ascii="Arial" w:hAnsi="Arial" w:cs="Arial" w:eastAsia="Arial"/>
+                <w:b w:val="0"/>
+                <w:color w:val="26343B"/>
+                <w:sz w:val="21"/>
+                <w:rtl w:val="1"/>
+                <w:lang w:bidi="ar-EG"/>
+                <w:szCs w:val="21"/>
+                <w:bCs w:val="0"/>
+              </w:rPr>
+              <w:t>مهتم لكن محتاج جدول سداد أو تسليم، أو قراره بعد فترة.</w:t>
+            </w:r>
+          </w:p>
+        </w:tc>
+        <w:tc>
+          <w:tcPr>
+            <w:tcW w:type="dxa" w:w="3289"/>
+            <w:vAlign w:val="center"/>
+          </w:tcPr>
+          <w:p>
+            <w:pPr>
+              <w:keepNext/>
+              <w:bidi w:val="1"/>
+              <w:spacing w:before="100" w:after="100"/>
+              <w:jc w:val="right"/>
+            </w:pPr>
+            <w:r>
+              <w:rPr>
+                <w:rFonts w:ascii="Arial" w:hAnsi="Arial" w:cs="Arial" w:eastAsia="Arial"/>
+                <w:b w:val="0"/>
+                <w:color w:val="26343B"/>
+                <w:sz w:val="21"/>
+                <w:rtl w:val="1"/>
+                <w:lang w:bidi="ar-EG"/>
+                <w:szCs w:val="21"/>
+                <w:bCs w:val="0"/>
+              </w:rPr>
+              <w:t>نبعت معلومة مناسبة ونتفق على موعد متابعة.</w:t>
+            </w:r>
+          </w:p>
+        </w:tc>
+      </w:tr>
+      <w:tr>
+        <w:trPr>
+          <w:cantSplit/>
+        </w:trPr>
+        <w:tc>
+          <w:tcPr>
+            <w:tcW w:type="dxa" w:w="3289"/>
+            <w:vAlign w:val="center"/>
+          </w:tcPr>
+          <w:p>
+            <w:pPr>
+              <w:bidi w:val="1"/>
+              <w:spacing w:before="100" w:after="100"/>
+              <w:jc w:val="right"/>
+            </w:pPr>
+            <w:r>
+              <w:rPr>
+                <w:rFonts w:ascii="Arial" w:hAnsi="Arial" w:cs="Arial" w:eastAsia="Arial"/>
+                <w:b w:val="0"/>
+                <w:color w:val="26343B"/>
+                <w:sz w:val="21"/>
+                <w:rtl w:val="1"/>
+                <w:lang w:bidi="ar-EG"/>
+                <w:szCs w:val="21"/>
+                <w:bCs w:val="0"/>
+              </w:rPr>
+              <w:t>غير مناسب حاليًا أو بيانات غير صالحة</w:t>
+            </w:r>
+          </w:p>
+        </w:tc>
+        <w:tc>
+          <w:tcPr>
+            <w:tcW w:type="dxa" w:w="3289"/>
+            <w:vAlign w:val="center"/>
+          </w:tcPr>
+          <w:p>
+            <w:pPr>
+              <w:bidi w:val="1"/>
+              <w:spacing w:before="100" w:after="100"/>
+              <w:jc w:val="right"/>
+            </w:pPr>
+            <w:r>
+              <w:rPr>
+                <w:rFonts w:ascii="Arial" w:hAnsi="Arial" w:cs="Arial" w:eastAsia="Arial"/>
+                <w:b w:val="0"/>
+                <w:color w:val="26343B"/>
+                <w:sz w:val="21"/>
+                <w:rtl w:val="1"/>
+                <w:lang w:bidi="ar-EG"/>
+                <w:szCs w:val="21"/>
+                <w:bCs w:val="0"/>
+              </w:rPr>
+              <w:t>احتياج لا يطابق المشروع أو رقم مكرر/غير صالح بعد التحقق.</w:t>
+            </w:r>
+          </w:p>
+        </w:tc>
+        <w:tc>
+          <w:tcPr>
+            <w:tcW w:type="dxa" w:w="3289"/>
+            <w:vAlign w:val="center"/>
+          </w:tcPr>
+          <w:p>
+            <w:pPr>
+              <w:bidi w:val="1"/>
+              <w:spacing w:before="100" w:after="100"/>
+              <w:jc w:val="right"/>
+            </w:pPr>
+            <w:r>
+              <w:rPr>
+                <w:rFonts w:ascii="Arial" w:hAnsi="Arial" w:cs="Arial" w:eastAsia="Arial"/>
+                <w:b w:val="0"/>
+                <w:color w:val="26343B"/>
+                <w:sz w:val="21"/>
+                <w:rtl w:val="1"/>
+                <w:lang w:bidi="ar-EG"/>
+                <w:szCs w:val="21"/>
+                <w:bCs w:val="0"/>
+              </w:rPr>
+              <w:t>نسجل السبب ونستبعد التكرار من تقرير العملاء الفريدين.</w:t>
+            </w:r>
+          </w:p>
+        </w:tc>
+      </w:tr>
+    </w:tbl>
+    <w:p>
+      <w:pPr>
+        <w:spacing w:after="40"/>
+      </w:pPr>
+    </w:p>
+    <w:p>
+      <w:pPr>
+        <w:bidi w:val="1"/>
+        <w:jc w:val="right"/>
+      </w:pPr>
+      <w:r>
+        <w:rPr>
+          <w:rFonts w:ascii="Arial" w:hAnsi="Arial" w:cs="Arial" w:eastAsia="Arial"/>
+          <w:b w:val="0"/>
+          <w:sz w:val="24"/>
+          <w:rtl w:val="1"/>
+          <w:lang w:bidi="ar-EG"/>
+          <w:szCs w:val="24"/>
+          <w:bCs w:val="0"/>
+        </w:rPr>
+        <w:t>نسجّل العملاء في ملف موحد أو CRM: التاريخ، الحملة، الإعلان، رقم العميل، إجابات التأهيل، التصنيف، نتيجة التواصل، المعاينة والخطوة الجاية. نتابع عملاء الرسائل والليدز بنفس معايير الجودة عشان المقارنة تبقى عادلة.</w:t>
+      </w:r>
+    </w:p>
+    <w:p>
+      <w:pPr>
+        <w:pStyle w:val="Heading2"/>
+        <w:keepNext/>
+        <w:bidi w:val="1"/>
+        <w:jc w:val="right"/>
+      </w:pPr>
+      <w:r>
+        <w:rPr>
+          <w:rFonts w:ascii="Arial" w:hAnsi="Arial" w:cs="Arial" w:eastAsia="Arial"/>
+          <w:b/>
+          <w:color w:val="216575"/>
+          <w:sz w:val="28"/>
+          <w:rtl w:val="1"/>
+          <w:lang w:bidi="ar-EG"/>
+          <w:szCs w:val="28"/>
+          <w:bCs w:val="1"/>
+        </w:rPr>
+        <w:t>مراجعة الصرف والجودة</w:t>
+      </w:r>
+    </w:p>
+    <w:p>
+      <w:pPr>
+        <w:bidi w:val="1"/>
+        <w:spacing w:after="80"/>
+        <w:ind w:right="170"/>
+        <w:jc w:val="right"/>
+      </w:pPr>
+      <w:r>
+        <w:rPr>
+          <w:rFonts w:ascii="Arial" w:hAnsi="Arial" w:cs="Arial" w:eastAsia="Arial"/>
+          <w:b w:val="0"/>
+          <w:sz w:val="24"/>
+          <w:rtl w:val="1"/>
+          <w:lang w:bidi="ar-EG"/>
+          <w:szCs w:val="24"/>
+          <w:bCs w:val="0"/>
+        </w:rPr>
+        <w:t>•  يوميًا: الصرف الفعلي، سرعة الرد، صلاحية الأرقام، وتحديث حالات المتابعة.</w:t>
+      </w:r>
+    </w:p>
+    <w:p>
+      <w:pPr>
+        <w:bidi w:val="1"/>
+        <w:spacing w:after="80"/>
+        <w:ind w:right="170"/>
+        <w:jc w:val="right"/>
+      </w:pPr>
+      <w:r>
+        <w:rPr>
+          <w:rFonts w:ascii="Arial" w:hAnsi="Arial" w:cs="Arial" w:eastAsia="Arial"/>
+          <w:b w:val="0"/>
+          <w:sz w:val="24"/>
+          <w:rtl w:val="1"/>
+          <w:lang w:bidi="ar-EG"/>
+          <w:szCs w:val="24"/>
+          <w:bCs w:val="0"/>
+        </w:rPr>
+        <w:t>•  في نهاية أول أسبوع: تقييم الرسائل والإبداعات، وتجهيز الانتقال لليدز في اليوم ٨.</w:t>
+      </w:r>
+    </w:p>
+    <w:p>
+      <w:pPr>
+        <w:bidi w:val="1"/>
+        <w:spacing w:after="80"/>
+        <w:ind w:right="170"/>
+        <w:jc w:val="right"/>
+      </w:pPr>
+      <w:r>
+        <w:rPr>
+          <w:rFonts w:ascii="Arial" w:hAnsi="Arial" w:cs="Arial" w:eastAsia="Arial"/>
+          <w:b w:val="0"/>
+          <w:sz w:val="24"/>
+          <w:rtl w:val="1"/>
+          <w:lang w:bidi="ar-EG"/>
+          <w:szCs w:val="24"/>
+          <w:bCs w:val="0"/>
+        </w:rPr>
+        <w:t>•  من اليوم ٨: مراجعة دورية للتأهيل والمعاينات، وتحويل الإنفاق بين الإعلانات الأفضل داخل سقف الـ١٬٠٠٠ جنيه اليومي المستهدف.</w:t>
+      </w:r>
+    </w:p>
+    <w:p>
+      <w:pPr>
+        <w:bidi w:val="1"/>
+        <w:spacing w:after="80"/>
+        <w:ind w:right="170"/>
+        <w:jc w:val="right"/>
+      </w:pPr>
+      <w:r>
+        <w:rPr>
+          <w:rFonts w:ascii="Arial" w:hAnsi="Arial" w:cs="Arial" w:eastAsia="Arial"/>
+          <w:b w:val="0"/>
+          <w:sz w:val="24"/>
+          <w:rtl w:val="1"/>
+          <w:lang w:bidi="ar-EG"/>
+          <w:szCs w:val="24"/>
+          <w:bCs w:val="0"/>
+        </w:rPr>
+        <w:t>•  مؤشرات الجودة: نسبة العملاء المؤهلين من العملاء الفريدين، تكلفة العميل المؤهل، نسبة التواصل الناجح، المعاينات الفعلية وتكلفتها، ثم الحجوزات.</w:t>
+      </w:r>
+    </w:p>
+    <w:p>
+      <w:pPr>
+        <w:bidi w:val="1"/>
+        <w:spacing w:after="80"/>
+        <w:ind w:right="170"/>
+        <w:jc w:val="right"/>
+      </w:pPr>
+      <w:r>
+        <w:rPr>
+          <w:rFonts w:ascii="Arial" w:hAnsi="Arial" w:cs="Arial" w:eastAsia="Arial"/>
+          <w:b w:val="0"/>
+          <w:sz w:val="24"/>
+          <w:rtl w:val="1"/>
+          <w:lang w:bidi="ar-EG"/>
+          <w:szCs w:val="24"/>
+          <w:bCs w:val="0"/>
+        </w:rPr>
+        <w:t>•  تكلفة العميل المؤهل = إنفاق المرحلة ÷ عدد عملائها المؤهلين. ما نقارنش الرسالة الخام بالليد الخام كأنهم نفس النتيجة.</w:t>
+      </w:r>
+    </w:p>
+    <w:p>
+      <w:pPr>
+        <w:bidi w:val="1"/>
+        <w:jc w:val="right"/>
+      </w:pPr>
+      <w:r>
+        <w:rPr>
+          <w:rFonts w:ascii="Arial" w:hAnsi="Arial" w:cs="Arial" w:eastAsia="Arial"/>
+          <w:b w:val="0"/>
+          <w:sz w:val="24"/>
+          <w:rtl w:val="1"/>
+          <w:lang w:bidi="ar-EG"/>
+          <w:szCs w:val="24"/>
+          <w:bCs w:val="0"/>
+        </w:rPr>
+        <w:t>عدد الليدز والمعاينات والحجوزات يتحدد بعد نتائج فعلية. الأولوية لجودة العميل وتكلفة المعاينة، حتى لو عدد الاستفسارات الخام قل. الخطة دي توثيق للإنفاق المقترح، ومش معناها إن حملات فعلية اتطلقت أو إن المبلغ اتصرف.</w:t>
+      </w:r>
+    </w:p>
+    <w:p>
       <w:pPr>
         <w:pStyle w:val="Heading1"/>
         <w:keepNext/>
@@ -4991,85 +7040,7 @@
           <w:szCs w:val="24"/>
           <w:bCs w:val="0"/>
         </w:rPr>
-        <w:t>توزيع مبدئي لميزانية الإعلانات فقط، منفصل عن التصوير والإنتاج:</w:t>
-      </w:r>
-    </w:p>
-    <w:p>
-      <w:pPr>
-        <w:bidi w:val="1"/>
-        <w:spacing w:after="80"/>
-        <w:ind w:right="170"/>
-        <w:jc w:val="right"/>
-      </w:pPr>
-      <w:r>
-        <w:rPr>
-          <w:rFonts w:ascii="Arial" w:hAnsi="Arial" w:cs="Arial" w:eastAsia="Arial"/>
-          <w:b w:val="0"/>
-          <w:sz w:val="24"/>
-          <w:rtl w:val="1"/>
-          <w:lang w:bidi="ar-EG"/>
-          <w:szCs w:val="24"/>
-          <w:bCs w:val="0"/>
-        </w:rPr>
-        <w:t>•  ٦٠٪ لاختبار الوصول لعملاء جدد برسائل مختلفة.</w:t>
-      </w:r>
-    </w:p>
-    <w:p>
-      <w:pPr>
-        <w:bidi w:val="1"/>
-        <w:spacing w:after="80"/>
-        <w:ind w:right="170"/>
-        <w:jc w:val="right"/>
-      </w:pPr>
-      <w:r>
-        <w:rPr>
-          <w:rFonts w:ascii="Arial" w:hAnsi="Arial" w:cs="Arial" w:eastAsia="Arial"/>
-          <w:b w:val="0"/>
-          <w:sz w:val="24"/>
-          <w:rtl w:val="1"/>
-          <w:lang w:bidi="ar-EG"/>
-          <w:szCs w:val="24"/>
-          <w:bCs w:val="0"/>
-        </w:rPr>
-        <w:t>•  ٢٥٪ لإعادة الوصول للمهتمين، لما حجم الجمهور يسمح.</w:t>
-      </w:r>
-    </w:p>
-    <w:p>
-      <w:pPr>
-        <w:bidi w:val="1"/>
-        <w:spacing w:after="80"/>
-        <w:ind w:right="170"/>
-        <w:jc w:val="right"/>
-      </w:pPr>
-      <w:r>
-        <w:rPr>
-          <w:rFonts w:ascii="Arial" w:hAnsi="Arial" w:cs="Arial" w:eastAsia="Arial"/>
-          <w:b w:val="0"/>
-          <w:sz w:val="24"/>
-          <w:rtl w:val="1"/>
-          <w:lang w:bidi="ar-EG"/>
-          <w:szCs w:val="24"/>
-          <w:bCs w:val="0"/>
-        </w:rPr>
-        <w:t>•  ١٥٪ لاختبار إبداعات وشرائح جديدة.</w:t>
-      </w:r>
-    </w:p>
-    <w:p>
-      <w:pPr>
-        <w:bidi w:val="1"/>
-        <w:jc w:val="right"/>
-      </w:pPr>
-      <w:r>
-        <w:rPr>
-          <w:rFonts w:ascii="Arial" w:hAnsi="Arial" w:cs="Arial" w:eastAsia="Arial"/>
-          <w:b w:val="0"/>
-          <w:sz w:val="24"/>
-          <w:rtl w:val="1"/>
-          <w:lang w:bidi="ar-EG"/>
-          <w:szCs w:val="24"/>
-          <w:bCs w:val="0"/>
-        </w:rPr>
-        <w:t>نعدّل التوزيع حسب تكلفة المعاينة وجودتها، مش أرخص رسالة. ولو الميزانية محدودة، نقلل عدد الاختبارات عشان كل اختبار ياخد فرصة كفاية.</w:t>
+        <w:t>خطة الصرف المعتمدة في الاستراتيجية موضحة في القسم ٦: ٧٬٠٠٠ جنيه رسائل لأول أسبوع، وبعدها ٢٣٬٠٠٠ جنيه ليدز لباقي الـ٣٠ يوم. إجمالي الشهر ٣٠٬٠٠٠ جنيه، من غير أي ميزانية موازية أو إضافية.</w:t>
       </w:r>
     </w:p>
     <w:p>
@@ -5119,6 +7090,7 @@
           </w:tcPr>
           <w:p>
             <w:pPr>
+              <w:keepNext/>
               <w:bidi w:val="1"/>
               <w:spacing w:before="100" w:after="100"/>
               <w:jc w:val="right"/>
@@ -5146,6 +7118,7 @@
           </w:tcPr>
           <w:p>
             <w:pPr>
+              <w:keepNext/>
               <w:bidi w:val="1"/>
               <w:spacing w:before="100" w:after="100"/>
               <w:jc w:val="right"/>
@@ -5173,6 +7146,7 @@
           </w:tcPr>
           <w:p>
             <w:pPr>
+              <w:keepNext/>
               <w:bidi w:val="1"/>
               <w:spacing w:before="100" w:after="100"/>
               <w:jc w:val="right"/>
@@ -5204,6 +7178,7 @@
           </w:tcPr>
           <w:p>
             <w:pPr>
+              <w:keepNext/>
               <w:bidi w:val="1"/>
               <w:spacing w:before="100" w:after="100"/>
               <w:jc w:val="right"/>
@@ -5230,6 +7205,7 @@
           </w:tcPr>
           <w:p>
             <w:pPr>
+              <w:keepNext/>
               <w:bidi w:val="1"/>
               <w:spacing w:before="100" w:after="100"/>
               <w:jc w:val="right"/>
@@ -5256,6 +7232,7 @@
           </w:tcPr>
           <w:p>
             <w:pPr>
+              <w:keepNext/>
               <w:bidi w:val="1"/>
               <w:spacing w:before="100" w:after="100"/>
               <w:jc w:val="right"/>
@@ -5287,6 +7264,7 @@
           </w:tcPr>
           <w:p>
             <w:pPr>
+              <w:keepNext/>
               <w:bidi w:val="1"/>
               <w:spacing w:before="100" w:after="100"/>
               <w:jc w:val="right"/>
@@ -5313,6 +7291,7 @@
           </w:tcPr>
           <w:p>
             <w:pPr>
+              <w:keepNext/>
               <w:bidi w:val="1"/>
               <w:spacing w:before="100" w:after="100"/>
               <w:jc w:val="right"/>
@@ -5339,6 +7318,7 @@
           </w:tcPr>
           <w:p>
             <w:pPr>
+              <w:keepNext/>
               <w:bidi w:val="1"/>
               <w:spacing w:before="100" w:after="100"/>
               <w:jc w:val="right"/>
@@ -5370,6 +7350,7 @@
           </w:tcPr>
           <w:p>
             <w:pPr>
+              <w:keepNext/>
               <w:bidi w:val="1"/>
               <w:spacing w:before="100" w:after="100"/>
               <w:jc w:val="right"/>
@@ -5396,6 +7377,7 @@
           </w:tcPr>
           <w:p>
             <w:pPr>
+              <w:keepNext/>
               <w:bidi w:val="1"/>
               <w:spacing w:before="100" w:after="100"/>
               <w:jc w:val="right"/>
@@ -5422,6 +7404,7 @@
           </w:tcPr>
           <w:p>
             <w:pPr>
+              <w:keepNext/>
               <w:bidi w:val="1"/>
               <w:spacing w:before="100" w:after="100"/>
               <w:jc w:val="right"/>
@@ -5453,6 +7436,7 @@
           </w:tcPr>
           <w:p>
             <w:pPr>
+              <w:keepNext/>
               <w:bidi w:val="1"/>
               <w:spacing w:before="100" w:after="100"/>
               <w:jc w:val="right"/>
@@ -5479,6 +7463,7 @@
           </w:tcPr>
           <w:p>
             <w:pPr>
+              <w:keepNext/>
               <w:bidi w:val="1"/>
               <w:spacing w:before="100" w:after="100"/>
               <w:jc w:val="right"/>
@@ -5505,6 +7490,7 @@
           </w:tcPr>
           <w:p>
             <w:pPr>
+              <w:keepNext/>
               <w:bidi w:val="1"/>
               <w:spacing w:before="100" w:after="100"/>
               <w:jc w:val="right"/>
@@ -5849,7 +7835,7 @@
           <w:szCs w:val="24"/>
           <w:bCs w:val="0"/>
         </w:rPr>
-        <w:t>•  ميزانية التسويق وعدد أفراد فريق المبيعات.</w:t>
+        <w:t>•  عدد أفراد المبيعات، جاهزية فورم الليدز، وتفاصيل الرسوم والإنتاج المنفصلة عن ميزانية الإعلان.</w:t>
       </w:r>
     </w:p>
     <w:p>

</xml_diff>